<commit_message>
Actualizar notebooks, resultados de demo y declaracion IAG cumplimentada
</commit_message>
<xml_diff>
--- a/memoria/TFM_declaracion_uso_IAG_es_2026_RELLENADO.docx
+++ b/memoria/TFM_declaracion_uso_IAG_es_2026_RELLENADO.docx
@@ -1,6 +1,6 @@
 
 <file path=word/document.xml><?xml version="1.0" encoding="utf-8"?>
-<w:document xmlns:wpc="http://schemas.microsoft.com/office/word/2010/wordprocessingCanvas" xmlns:cx="http://schemas.microsoft.com/office/drawing/2014/chartex" xmlns:cx1="http://schemas.microsoft.com/office/drawing/2015/9/8/chartex" xmlns:cx2="http://schemas.microsoft.com/office/drawing/2015/10/21/chartex" xmlns:cx3="http://schemas.microsoft.com/office/drawing/2016/5/9/chartex" xmlns:cx4="http://schemas.microsoft.com/office/drawing/2016/5/10/chartex" xmlns:cx5="http://schemas.microsoft.com/office/drawing/2016/5/11/chartex" xmlns:cx6="http://schemas.microsoft.com/office/drawing/2016/5/12/chartex" xmlns:cx7="http://schemas.microsoft.com/office/drawing/2016/5/13/chartex" xmlns:cx8="http://schemas.microsoft.com/office/drawing/2016/5/14/chartex" xmlns:mc="http://schemas.openxmlformats.org/markup-compatibility/2006" xmlns:aink="http://schemas.microsoft.com/office/drawing/2016/ink" xmlns:am3d="http://schemas.microsoft.com/office/drawing/2017/model3d" xmlns:o="urn:schemas-microsoft-com:office:office" xmlns:oel="http://schemas.microsoft.com/office/2019/extlst" xmlns:r="http://schemas.openxmlformats.org/officeDocument/2006/relationships" xmlns:m="http://schemas.openxmlformats.org/officeDocument/2006/math" xmlns:v="urn:schemas-microsoft-com:vml" xmlns:wp14="http://schemas.microsoft.com/office/word/2010/wordprocessingDrawing" xmlns:wp="http://schemas.openxmlformats.org/drawingml/2006/wordprocessingDrawing" xmlns:w10="urn:schemas-microsoft-com:office:word" xmlns:w="http://schemas.openxmlformats.org/wordprocessingml/2006/main" xmlns:w14="http://schemas.microsoft.com/office/word/2010/wordml" xmlns:w15="http://schemas.microsoft.com/office/word/2012/wordml" xmlns:w16cex="http://schemas.microsoft.com/office/word/2018/wordml/cex" xmlns:w16cid="http://schemas.microsoft.com/office/word/2016/wordml/cid" xmlns:w16="http://schemas.microsoft.com/office/word/2018/wordml" xmlns:w16du="http://schemas.microsoft.com/office/word/2023/wordml/word16du" xmlns:w16sdtdh="http://schemas.microsoft.com/office/word/2020/wordml/sdtdatahash" xmlns:w16sdtfl="http://schemas.microsoft.com/office/word/2024/wordml/sdtformatlock" xmlns:w16se="http://schemas.microsoft.com/office/word/2015/wordml/symex" xmlns:wpg="http://schemas.microsoft.com/office/word/2010/wordprocessingGroup" xmlns:wpi="http://schemas.microsoft.com/office/word/2010/wordprocessingInk" xmlns:wne="http://schemas.microsoft.com/office/word/2006/wordml" xmlns:wps="http://schemas.microsoft.com/office/word/2010/wordprocessingShape" mc:Ignorable="w14 w15 w16se w16cid w16 w16cex w16sdtdh w16sdtfl w16du wp14">
+<w:document xmlns:wpc="http://schemas.microsoft.com/office/word/2010/wordprocessingCanvas" xmlns:mc="http://schemas.openxmlformats.org/markup-compatibility/2006" xmlns:o="urn:schemas-microsoft-com:office:office" xmlns:r="http://schemas.openxmlformats.org/officeDocument/2006/relationships" xmlns:m="http://schemas.openxmlformats.org/officeDocument/2006/math" xmlns:v="urn:schemas-microsoft-com:vml" xmlns:wp14="http://schemas.microsoft.com/office/word/2010/wordprocessingDrawing" xmlns:wp="http://schemas.openxmlformats.org/drawingml/2006/wordprocessingDrawing" xmlns:w10="urn:schemas-microsoft-com:office:word" xmlns:w="http://schemas.openxmlformats.org/wordprocessingml/2006/main" xmlns:w14="http://schemas.microsoft.com/office/word/2010/wordml" xmlns:w15="http://schemas.microsoft.com/office/word/2012/wordml" xmlns:w16se="http://schemas.microsoft.com/office/word/2015/wordml/symex" xmlns:w16cid="http://schemas.microsoft.com/office/word/2016/wordml/cid" xmlns:w16="http://schemas.microsoft.com/office/word/2018/wordml" xmlns:w16cex="http://schemas.microsoft.com/office/word/2018/wordml/cex" xmlns:w16sdtdh="http://schemas.microsoft.com/office/word/2020/wordml/sdtdatahash" xmlns:wne="http://schemas.microsoft.com/office/word/2006/wordml" xmlns:wpg="http://schemas.microsoft.com/office/word/2010/wordprocessingGroup" xmlns:wps="http://schemas.microsoft.com/office/word/2010/wordprocessingShape" mc:Ignorable="w14 w15 w16se w16cid w16 w16cex w16sdtdh wp14">
   <w:body>
     <w:p>
       <w:pPr>
@@ -12,28 +12,23 @@
         </w:rPr>
       </w:pPr>
       <w:r>
-        <w:rPr>
-          <w:b/>
-          <w:noProof/>
-          <w:sz w:val="24"/>
-          <w:szCs w:val="24"/>
-        </w:rPr>
         <w:drawing>
-          <wp:inline distT="0" distB="0" distL="0" distR="0" wp14:anchorId="46ACC231" wp14:editId="6CA2ACC3">
-            <wp:extent cx="1988614" cy="639158"/>
+          <wp:inline distT="0" distB="0" distL="0" distR="0">
+            <wp:extent cx="1990725" cy="638175"/>
             <wp:effectExtent l="0" t="0" r="0" b="0"/>
-            <wp:docPr id="27" name="image1.png"/>
-            <wp:cNvGraphicFramePr/>
+            <wp:docPr id="100000" name="Picture 100000"/>
+            <wp:cNvGraphicFramePr>
+              <a:graphicFrameLocks xmlns:a="http://schemas.openxmlformats.org/drawingml/2006/main" noChangeAspect="1"/>
+            </wp:cNvGraphicFramePr>
             <a:graphic xmlns:a="http://schemas.openxmlformats.org/drawingml/2006/main">
               <a:graphicData uri="http://schemas.openxmlformats.org/drawingml/2006/picture">
                 <pic:pic xmlns:pic="http://schemas.openxmlformats.org/drawingml/2006/picture">
                   <pic:nvPicPr>
-                    <pic:cNvPr id="0" name="image1.png"/>
-                    <pic:cNvPicPr preferRelativeResize="0"/>
+                    <pic:cNvPr id="100000" name="image100000"/>
+                    <pic:cNvPicPr/>
                   </pic:nvPicPr>
                   <pic:blipFill>
-                    <a:blip r:embed="rId8"/>
-                    <a:srcRect/>
+                    <a:blip r:embed="rId15"/>
                     <a:stretch>
                       <a:fillRect/>
                     </a:stretch>
@@ -41,12 +36,11 @@
                   <pic:spPr>
                     <a:xfrm>
                       <a:off x="0" y="0"/>
-                      <a:ext cx="1988614" cy="639158"/>
+                      <a:ext cx="1990725" cy="638175"/>
                     </a:xfrm>
                     <a:prstGeom prst="rect">
                       <a:avLst/>
                     </a:prstGeom>
-                    <a:ln/>
                   </pic:spPr>
                 </pic:pic>
               </a:graphicData>
@@ -75,63 +69,103 @@
       </w:pPr>
       <w:r>
         <w:rPr>
-          <w:b/>
+          <w:rFonts w:ascii="Arial" w:hAnsi="Arial" w:eastAsia="Arial" w:cs="Arial"/>
+          <w:b/>
+          <w:bCs/>
+          <w:sz w:val="22"/>
+          <w:szCs w:val="22"/>
         </w:rPr>
         <w:t xml:space="preserve">DECLARACIÓN DE USO DE INTELIGENCIA ARTIFICIAL GENERATIVA (IAG) EN </w:t>
       </w:r>
       <w:r>
         <w:rPr>
-          <w:b/>
+          <w:rFonts w:ascii="Arial" w:hAnsi="Arial" w:eastAsia="Arial" w:cs="Arial"/>
+          <w:b/>
+          <w:bCs/>
+          <w:sz w:val="22"/>
+          <w:szCs w:val="22"/>
         </w:rPr>
         <w:t xml:space="preserve">EL TRABAJO DE FIN DE </w:t>
       </w:r>
       <w:r>
         <w:rPr>
-          <w:b/>
+          <w:rFonts w:ascii="Arial" w:hAnsi="Arial" w:eastAsia="Arial" w:cs="Arial"/>
+          <w:b/>
+          <w:bCs/>
+          <w:sz w:val="22"/>
+          <w:szCs w:val="22"/>
         </w:rPr>
         <w:t>MÁSTER</w:t>
       </w:r>
       <w:r>
         <w:rPr>
-          <w:b/>
+          <w:rFonts w:ascii="Arial" w:hAnsi="Arial" w:eastAsia="Arial" w:cs="Arial"/>
+          <w:b/>
+          <w:bCs/>
+          <w:sz w:val="22"/>
+          <w:szCs w:val="22"/>
         </w:rPr>
         <w:t xml:space="preserve"> (TF</w:t>
       </w:r>
       <w:r>
         <w:rPr>
-          <w:b/>
+          <w:rFonts w:ascii="Arial" w:hAnsi="Arial" w:eastAsia="Arial" w:cs="Arial"/>
+          <w:b/>
+          <w:bCs/>
+          <w:sz w:val="22"/>
+          <w:szCs w:val="22"/>
         </w:rPr>
         <w:t>M</w:t>
       </w:r>
       <w:r>
         <w:rPr>
-          <w:b/>
+          <w:rFonts w:ascii="Arial" w:hAnsi="Arial" w:eastAsia="Arial" w:cs="Arial"/>
+          <w:b/>
+          <w:bCs/>
+          <w:sz w:val="22"/>
+          <w:szCs w:val="22"/>
         </w:rPr>
         <w:t>)</w:t>
       </w:r>
     </w:p>
-    <w:p/>
-    <w:p>
-      <w:pPr>
-        <w:rPr>
-          <w:b/>
-        </w:rPr>
-      </w:pPr>
-      <w:r>
-        <w:rPr>
-          <w:b/>
+    <w:p>
+      <w:pPr>
+        <w:spacing w:line="276" w:lineRule="auto"/>
+      </w:pPr>
+    </w:p>
+    <w:p>
+      <w:pPr>
+        <w:rPr>
+          <w:b/>
+        </w:rPr>
+      </w:pPr>
+      <w:r>
+        <w:rPr>
+          <w:rFonts w:ascii="Arial" w:hAnsi="Arial" w:eastAsia="Arial" w:cs="Arial"/>
+          <w:b/>
+          <w:bCs/>
+          <w:sz w:val="22"/>
+          <w:szCs w:val="22"/>
         </w:rPr>
         <w:t>He usado IAG en mi T</w:t>
       </w:r>
       <w:r>
         <w:rPr>
-          <w:b/>
+          <w:rFonts w:ascii="Arial" w:hAnsi="Arial" w:eastAsia="Arial" w:cs="Arial"/>
+          <w:b/>
+          <w:bCs/>
+          <w:sz w:val="22"/>
+          <w:szCs w:val="22"/>
         </w:rPr>
         <w:t>F</w:t>
       </w:r>
       <w:r>
         <w:rPr>
-          <w:b/>
+          <w:rFonts w:ascii="Arial" w:hAnsi="Arial" w:eastAsia="Arial" w:cs="Arial"/>
+          <w:b/>
+          <w:bCs/>
+          <w:sz w:val="22"/>
+          <w:szCs w:val="22"/>
         </w:rPr>
         <w:t>M</w:t>
       </w:r>
@@ -144,9 +178,13 @@
       </w:pPr>
       <w:r>
         <w:rPr>
-          <w:b/>
-        </w:rPr>
-        <w:t>Marca lo que corresponda:   [X] SÍ      [  ] NO</w:t>
+          <w:rFonts w:ascii="Arial" w:hAnsi="Arial" w:eastAsia="Arial" w:cs="Arial"/>
+          <w:b/>
+          <w:bCs/>
+          <w:sz w:val="22"/>
+          <w:szCs w:val="22"/>
+        </w:rPr>
+        <w:t xml:space="preserve">Marca lo que corresponda:   [X] SÍ      [  ] NO</w:t>
       </w:r>
     </w:p>
     <w:sdt>
@@ -159,7 +197,7 @@
         <w:tbl>
           <w:tblPr>
             <w:tblStyle w:val="ae"/>
-            <w:tblpPr w:leftFromText="180" w:rightFromText="180" w:topFromText="180" w:bottomFromText="180" w:vertAnchor="text" w:tblpY="133"/>
+            <w:tblpPr w:vertAnchor="text" w:tblpY="133" w:topFromText="180" w:bottomFromText="180" w:leftFromText="180" w:rightFromText="180"/>
             <w:tblW w:w="1140" w:type="dxa"/>
             <w:tblInd w:w="0" w:type="dxa"/>
             <w:tblBorders>
@@ -171,7 +209,11 @@
               <w:insideV w:val="single" w:sz="4" w:space="0" w:color="000000"/>
             </w:tblBorders>
             <w:tblLayout w:type="fixed"/>
-            <w:tblLook w:val="0400" w:firstRow="0" w:lastRow="0" w:firstColumn="0" w:lastColumn="0" w:noHBand="0" w:noVBand="1"/>
+            <w:tblCellMar>
+              <w:left w:w="108" w:type="dxa"/>
+              <w:right w:w="108" w:type="dxa"/>
+            </w:tblCellMar>
+            <w:tblLook w:noVBand="1"/>
           </w:tblPr>
           <w:tblGrid>
             <w:gridCol w:w="525"/>
@@ -181,6 +223,16 @@
             <w:tc>
               <w:tcPr>
                 <w:tcW w:w="525" w:type="dxa"/>
+                <w:tcBorders>
+                  <w:top w:val="single" w:sz="4" w:space="0" w:color="000000"/>
+                  <w:left w:val="single" w:sz="4" w:space="0" w:color="000000"/>
+                  <w:bottom w:val="single" w:sz="4" w:space="0" w:color="000000"/>
+                  <w:right w:val="single" w:sz="4" w:space="0" w:color="000000"/>
+                </w:tcBorders>
+                <w:tcMar>
+                  <w:left w:w="108" w:type="dxa"/>
+                  <w:right w:w="108" w:type="dxa"/>
+                </w:tcMar>
                 <w:vAlign w:val="center"/>
               </w:tcPr>
               <w:p>
@@ -191,7 +243,11 @@
                 </w:pPr>
                 <w:r>
                   <w:rPr>
+                    <w:rFonts w:ascii="Arial" w:hAnsi="Arial" w:eastAsia="Arial" w:cs="Arial"/>
                     <w:b/>
+                    <w:bCs/>
+                    <w:sz w:val="22"/>
+                    <w:szCs w:val="22"/>
                   </w:rPr>
                   <w:t>SI</w:t>
                 </w:r>
@@ -200,6 +256,16 @@
             <w:tc>
               <w:tcPr>
                 <w:tcW w:w="615" w:type="dxa"/>
+                <w:tcBorders>
+                  <w:top w:val="single" w:sz="4" w:space="0" w:color="000000"/>
+                  <w:left w:val="single" w:sz="4" w:space="0" w:color="000000"/>
+                  <w:bottom w:val="single" w:sz="4" w:space="0" w:color="000000"/>
+                  <w:right w:val="single" w:sz="4" w:space="0" w:color="000000"/>
+                </w:tcBorders>
+                <w:tcMar>
+                  <w:left w:w="108" w:type="dxa"/>
+                  <w:right w:w="108" w:type="dxa"/>
+                </w:tcMar>
                 <w:vAlign w:val="center"/>
               </w:tcPr>
               <w:p>
@@ -210,7 +276,11 @@
                 </w:pPr>
                 <w:r>
                   <w:rPr>
+                    <w:rFonts w:ascii="Arial" w:hAnsi="Arial" w:eastAsia="Arial" w:cs="Arial"/>
                     <w:b/>
+                    <w:bCs/>
+                    <w:sz w:val="22"/>
+                    <w:szCs w:val="22"/>
                   </w:rPr>
                   <w:t>NO</w:t>
                 </w:r>
@@ -252,7 +322,11 @@
       </w:pPr>
       <w:r>
         <w:rPr>
-          <w:i/>
+          <w:rFonts w:ascii="Arial" w:hAnsi="Arial" w:eastAsia="Arial" w:cs="Arial"/>
+          <w:i/>
+          <w:iCs/>
+          <w:sz w:val="22"/>
+          <w:szCs w:val="22"/>
         </w:rPr>
         <w:t>Si has marcado SI, completa las siguientes 3 partes de este documento:</w:t>
       </w:r>
@@ -266,14 +340,18 @@
     </w:p>
     <w:p>
       <w:pPr>
-        <w:shd w:val="clear" w:color="auto" w:fill="D9D9D9"/>
-        <w:rPr>
-          <w:b/>
-        </w:rPr>
-      </w:pPr>
-      <w:r>
-        <w:rPr>
-          <w:b/>
+        <w:shd w:val="clear" w:fill="D9D9D9"/>
+        <w:rPr>
+          <w:b/>
+        </w:rPr>
+      </w:pPr>
+      <w:r>
+        <w:rPr>
+          <w:rFonts w:ascii="Arial" w:hAnsi="Arial" w:eastAsia="Arial" w:cs="Arial"/>
+          <w:b/>
+          <w:bCs/>
+          <w:sz w:val="22"/>
+          <w:szCs w:val="22"/>
         </w:rPr>
         <w:t>Parte 1: declaración sobre comportamiento legal, ético y responsable</w:t>
       </w:r>
@@ -290,25 +368,59 @@
         <w:jc w:val="both"/>
       </w:pPr>
       <w:r>
+        <w:rPr>
+          <w:rFonts w:ascii="Arial" w:hAnsi="Arial" w:eastAsia="Arial" w:cs="Arial"/>
+          <w:sz w:val="22"/>
+          <w:szCs w:val="22"/>
+        </w:rPr>
         <w:t xml:space="preserve">Ten presente que el uso de IAG conlleva unos riesgos y puede generar una serie de consecuencias académicas graves: </w:t>
       </w:r>
       <w:r>
+        <w:rPr>
+          <w:rFonts w:ascii="Arial" w:hAnsi="Arial" w:eastAsia="Arial" w:cs="Arial"/>
+          <w:sz w:val="22"/>
+          <w:szCs w:val="22"/>
+        </w:rPr>
         <w:t>el TF</w:t>
       </w:r>
       <w:r>
+        <w:rPr>
+          <w:rFonts w:ascii="Arial" w:hAnsi="Arial" w:eastAsia="Arial" w:cs="Arial"/>
+          <w:sz w:val="22"/>
+          <w:szCs w:val="22"/>
+        </w:rPr>
         <w:t>M</w:t>
       </w:r>
       <w:r>
+        <w:rPr>
+          <w:rFonts w:ascii="Arial" w:hAnsi="Arial" w:eastAsia="Arial" w:cs="Arial"/>
+          <w:sz w:val="22"/>
+          <w:szCs w:val="22"/>
+        </w:rPr>
         <w:t xml:space="preserve"> no será evaluad</w:t>
       </w:r>
       <w:r>
+        <w:rPr>
+          <w:rFonts w:ascii="Arial" w:hAnsi="Arial" w:eastAsia="Arial" w:cs="Arial"/>
+          <w:sz w:val="22"/>
+          <w:szCs w:val="22"/>
+        </w:rPr>
         <w:t>o</w:t>
       </w:r>
       <w:r>
+        <w:rPr>
+          <w:rFonts w:ascii="Arial" w:hAnsi="Arial" w:eastAsia="Arial" w:cs="Arial"/>
+          <w:sz w:val="22"/>
+          <w:szCs w:val="22"/>
+        </w:rPr>
         <w:t xml:space="preserve"> por la Universidad si el uso de la IAG comporta la utilización de datos de carácter confidencial, materiales protegidos por derechos de autoría, o datos de carácter personal, y se hace sin cumplir las condiciones exigidas en cada caso (autorización de los interesados, autorización de los titulares, seguimiento de las instrucciones de la Universidad). </w:t>
       </w:r>
     </w:p>
-    <w:p/>
+    <w:p>
+      <w:pPr>
+        <w:spacing w:line="276" w:lineRule="auto"/>
+      </w:pPr>
+    </w:p>
     <w:tbl>
       <w:tblPr>
         <w:tblStyle w:val="af"/>
@@ -323,7 +435,11 @@
           <w:insideV w:val="single" w:sz="4" w:space="0" w:color="000000"/>
         </w:tblBorders>
         <w:tblLayout w:type="fixed"/>
-        <w:tblLook w:val="0400" w:firstRow="0" w:lastRow="0" w:firstColumn="0" w:lastColumn="0" w:noHBand="0" w:noVBand="1"/>
+        <w:tblCellMar>
+          <w:left w:w="108" w:type="dxa"/>
+          <w:right w:w="108" w:type="dxa"/>
+        </w:tblCellMar>
+        <w:tblLook w:noVBand="1"/>
       </w:tblPr>
       <w:tblGrid>
         <w:gridCol w:w="4531"/>
@@ -337,6 +453,16 @@
           <w:tcPr>
             <w:tcW w:w="9000" w:type="dxa"/>
             <w:gridSpan w:val="2"/>
+            <w:tcBorders>
+              <w:top w:val="single" w:sz="4" w:space="0" w:color="000000"/>
+              <w:left w:val="single" w:sz="4" w:space="0" w:color="000000"/>
+              <w:bottom w:val="single" w:sz="4" w:space="0" w:color="000000"/>
+              <w:right w:val="single" w:sz="4" w:space="0" w:color="000000"/>
+            </w:tcBorders>
+            <w:tcMar>
+              <w:left w:w="108" w:type="dxa"/>
+              <w:right w:w="108" w:type="dxa"/>
+            </w:tcMar>
           </w:tcPr>
           <w:p>
             <w:pPr>
@@ -346,7 +472,11 @@
             </w:pPr>
             <w:r>
               <w:rPr>
+                <w:rFonts w:ascii="Arial" w:hAnsi="Arial" w:eastAsia="Arial" w:cs="Arial"/>
                 <w:b/>
+                <w:bCs/>
+                <w:sz w:val="22"/>
+                <w:szCs w:val="22"/>
               </w:rPr>
               <w:t>Pregunta</w:t>
             </w:r>
@@ -382,18 +512,33 @@
                 <w:numId w:val="1"/>
               </w:numPr>
               <w:spacing w:before="240" w:after="240"/>
+              <w:ind w:left="720" w:hanging="360"/>
               <w:jc w:val="both"/>
             </w:pPr>
             <w:r>
+              <w:rPr>
+                <w:rFonts w:ascii="Arial" w:hAnsi="Arial" w:eastAsia="Arial" w:cs="Arial"/>
+                <w:sz w:val="22"/>
+                <w:szCs w:val="22"/>
+              </w:rPr>
               <w:t xml:space="preserve">En mi interacción con herramientas de IAG he facilitado </w:t>
             </w:r>
             <w:r>
               <w:rPr>
+                <w:rFonts w:ascii="Arial" w:hAnsi="Arial" w:eastAsia="Arial" w:cs="Arial"/>
                 <w:b/>
+                <w:bCs/>
+                <w:sz w:val="22"/>
+                <w:szCs w:val="22"/>
               </w:rPr>
               <w:t xml:space="preserve">datos de carácter confidencial </w:t>
             </w:r>
             <w:r>
+              <w:rPr>
+                <w:rFonts w:ascii="Arial" w:hAnsi="Arial" w:eastAsia="Arial" w:cs="Arial"/>
+                <w:sz w:val="22"/>
+                <w:szCs w:val="22"/>
+              </w:rPr>
               <w:t>contando siempre con la debida autorización de los interesados. La confidencialidad abarca toda información que una persona u organización desea proteger por razones legales, comerciales, de privacidad o estratégicas (como patentes o secretos comerciales).</w:t>
             </w:r>
           </w:p>
@@ -421,8 +566,16 @@
             <w:vAlign w:val="center"/>
           </w:tcPr>
           <w:p>
+            <w:pPr>
+              <w:spacing w:line="276" w:lineRule="auto"/>
+            </w:pPr>
             <w:r>
-              <w:t>[  ] SÍ, he usado estos datos con la autorización de los interesados</w:t>
+              <w:rPr>
+                <w:rFonts w:ascii="Arial" w:hAnsi="Arial" w:eastAsia="Arial" w:cs="Arial"/>
+                <w:sz w:val="22"/>
+                <w:szCs w:val="22"/>
+              </w:rPr>
+              <w:t xml:space="preserve">[  ] SÍ, he usado estos datos con la autorización de los interesados</w:t>
             </w:r>
           </w:p>
         </w:tc>
@@ -444,9 +597,16 @@
             <w:vAlign w:val="center"/>
           </w:tcPr>
           <w:p>
+            <w:pPr>
+              <w:spacing w:line="276" w:lineRule="auto"/>
+            </w:pPr>
             <w:r>
               <w:rPr>
+                <w:rFonts w:ascii="Arial" w:hAnsi="Arial" w:eastAsia="Arial" w:cs="Arial"/>
                 <w:b/>
+                <w:bCs/>
+                <w:sz w:val="22"/>
+                <w:szCs w:val="22"/>
               </w:rPr>
               <w:t>[X] NO, no he usado datos de carácter confidencial</w:t>
             </w:r>
@@ -482,18 +642,33 @@
                 <w:numId w:val="1"/>
               </w:numPr>
               <w:spacing w:before="240" w:after="240"/>
+              <w:ind w:left="720" w:hanging="360"/>
               <w:jc w:val="both"/>
             </w:pPr>
             <w:r>
+              <w:rPr>
+                <w:rFonts w:ascii="Arial" w:hAnsi="Arial" w:eastAsia="Arial" w:cs="Arial"/>
+                <w:sz w:val="22"/>
+                <w:szCs w:val="22"/>
+              </w:rPr>
               <w:t xml:space="preserve">En mi interacción con herramientas de IAG he facilitado </w:t>
             </w:r>
             <w:r>
               <w:rPr>
+                <w:rFonts w:ascii="Arial" w:hAnsi="Arial" w:eastAsia="Arial" w:cs="Arial"/>
                 <w:b/>
+                <w:bCs/>
+                <w:sz w:val="22"/>
+                <w:szCs w:val="22"/>
               </w:rPr>
               <w:t>materiales protegidos por derechos de autoría</w:t>
             </w:r>
             <w:r>
+              <w:rPr>
+                <w:rFonts w:ascii="Arial" w:hAnsi="Arial" w:eastAsia="Arial" w:cs="Arial"/>
+                <w:sz w:val="22"/>
+                <w:szCs w:val="22"/>
+              </w:rPr>
               <w:t xml:space="preserve"> contando siempre con la autorización de los respectivos titulares.</w:t>
             </w:r>
           </w:p>
@@ -521,16 +696,56 @@
             <w:vAlign w:val="center"/>
           </w:tcPr>
           <w:p>
+            <w:pPr>
+              <w:spacing w:line="276" w:lineRule="auto"/>
+            </w:pPr>
             <w:r>
               <w:rPr>
+                <w:rFonts w:ascii="Arial" w:hAnsi="Arial" w:eastAsia="Arial" w:cs="Arial"/>
                 <w:b/>
+                <w:bCs/>
+                <w:sz w:val="22"/>
+                <w:szCs w:val="22"/>
               </w:rPr>
               <w:t>[X] SÍ, he usado estos materiales con autorización de los titulares de derechos de autor; o bien sin ella porque se ajustan a una de las excepciones o límites que permite la ley:</w:t>
-              <w:br/>
+            </w:r>
+            <w:r>
+              <w:br w:type="textWrapping"/>
+            </w:r>
+            <w:r>
+              <w:rPr>
+                <w:rFonts w:ascii="Arial" w:hAnsi="Arial" w:eastAsia="Arial" w:cs="Arial"/>
+                <w:b/>
+                <w:bCs/>
+                <w:sz w:val="22"/>
+                <w:szCs w:val="22"/>
+              </w:rPr>
               <w:t>- obra en dominio público</w:t>
-              <w:br/>
+            </w:r>
+            <w:r>
+              <w:br w:type="textWrapping"/>
+            </w:r>
+            <w:r>
+              <w:rPr>
+                <w:rFonts w:ascii="Arial" w:hAnsi="Arial" w:eastAsia="Arial" w:cs="Arial"/>
+                <w:b/>
+                <w:bCs/>
+                <w:sz w:val="22"/>
+                <w:szCs w:val="22"/>
+              </w:rPr>
               <w:t>- obra licenciada (licencias Creative Commons / Open Data Commons ODbL)</w:t>
-              <w:br/>
+            </w:r>
+            <w:r>
+              <w:br w:type="textWrapping"/>
+            </w:r>
+            <w:r>
+              <w:rPr>
+                <w:rFonts w:ascii="Arial" w:hAnsi="Arial" w:eastAsia="Arial" w:cs="Arial"/>
+                <w:b/>
+                <w:bCs/>
+                <w:sz w:val="22"/>
+                <w:szCs w:val="22"/>
+              </w:rPr>
               <w:t>- uso de fragmentos con fines de investigación (derecho de cita)</w:t>
             </w:r>
           </w:p>
@@ -553,8 +768,16 @@
             <w:vAlign w:val="center"/>
           </w:tcPr>
           <w:p>
+            <w:pPr>
+              <w:spacing w:line="276" w:lineRule="auto"/>
+            </w:pPr>
             <w:r>
-              <w:t>[  ] NO, no he usado materiales protegidos por derechos de autoría</w:t>
+              <w:rPr>
+                <w:rFonts w:ascii="Arial" w:hAnsi="Arial" w:eastAsia="Arial" w:cs="Arial"/>
+                <w:sz w:val="22"/>
+                <w:szCs w:val="22"/>
+              </w:rPr>
+              <w:t xml:space="preserve">[  ] NO, no he usado materiales protegidos por derechos de autoría</w:t>
             </w:r>
           </w:p>
         </w:tc>
@@ -588,18 +811,33 @@
                 <w:numId w:val="1"/>
               </w:numPr>
               <w:spacing w:before="240" w:after="240"/>
+              <w:ind w:left="720" w:hanging="360"/>
             </w:pPr>
             <w:r>
               <w:lastRenderedPageBreak/>
+              <w:rPr>
+                <w:rFonts w:ascii="Arial" w:hAnsi="Arial" w:eastAsia="Arial" w:cs="Arial"/>
+                <w:sz w:val="22"/>
+                <w:szCs w:val="22"/>
+              </w:rPr>
               <w:t xml:space="preserve">En mi interacción con herramientas de IAG he facilitado </w:t>
             </w:r>
             <w:r>
               <w:rPr>
+                <w:rFonts w:ascii="Arial" w:hAnsi="Arial" w:eastAsia="Arial" w:cs="Arial"/>
                 <w:b/>
+                <w:bCs/>
+                <w:sz w:val="22"/>
+                <w:szCs w:val="22"/>
               </w:rPr>
               <w:t>datos de carácter personal</w:t>
             </w:r>
             <w:r>
+              <w:rPr>
+                <w:rFonts w:ascii="Arial" w:hAnsi="Arial" w:eastAsia="Arial" w:cs="Arial"/>
+                <w:sz w:val="22"/>
+                <w:szCs w:val="22"/>
+              </w:rPr>
               <w:t xml:space="preserve"> con la debida autorización de los interesados.</w:t>
             </w:r>
           </w:p>
@@ -627,8 +865,16 @@
             <w:vAlign w:val="center"/>
           </w:tcPr>
           <w:p>
+            <w:pPr>
+              <w:spacing w:line="276" w:lineRule="auto"/>
+            </w:pPr>
             <w:r>
-              <w:t>[  ] SÍ, he usado estos datos con autorización de los interesados y conforme a las instrucciones contenidas en la guía aprobada por la Universidad</w:t>
+              <w:rPr>
+                <w:rFonts w:ascii="Arial" w:hAnsi="Arial" w:eastAsia="Arial" w:cs="Arial"/>
+                <w:sz w:val="22"/>
+                <w:szCs w:val="22"/>
+              </w:rPr>
+              <w:t xml:space="preserve">[  ] SÍ, he usado estos datos con autorización de los interesados y conforme a las instrucciones contenidas en la guía aprobada por la Universidad</w:t>
             </w:r>
           </w:p>
         </w:tc>
@@ -650,9 +896,16 @@
             <w:vAlign w:val="center"/>
           </w:tcPr>
           <w:p>
+            <w:pPr>
+              <w:spacing w:line="276" w:lineRule="auto"/>
+            </w:pPr>
             <w:r>
               <w:rPr>
+                <w:rFonts w:ascii="Arial" w:hAnsi="Arial" w:eastAsia="Arial" w:cs="Arial"/>
                 <w:b/>
+                <w:bCs/>
+                <w:sz w:val="22"/>
+                <w:szCs w:val="22"/>
               </w:rPr>
               <w:t>[X] NO, no he usado datos de carácter personal</w:t>
             </w:r>
@@ -667,6 +920,16 @@
           <w:tcPr>
             <w:tcW w:w="9000" w:type="dxa"/>
             <w:gridSpan w:val="2"/>
+            <w:tcBorders>
+              <w:top w:val="single" w:sz="4" w:space="0" w:color="000000"/>
+              <w:left w:val="single" w:sz="4" w:space="0" w:color="000000"/>
+              <w:bottom w:val="single" w:sz="4" w:space="0" w:color="000000"/>
+              <w:right w:val="single" w:sz="4" w:space="0" w:color="000000"/>
+            </w:tcBorders>
+            <w:tcMar>
+              <w:left w:w="108" w:type="dxa"/>
+              <w:right w:w="108" w:type="dxa"/>
+            </w:tcMar>
             <w:vAlign w:val="center"/>
           </w:tcPr>
           <w:p>
@@ -681,23 +944,38 @@
                 <w:ilvl w:val="0"/>
                 <w:numId w:val="1"/>
               </w:numPr>
+              <w:ind w:left="720" w:hanging="360"/>
               <w:jc w:val="both"/>
             </w:pPr>
             <w:r>
+              <w:rPr>
+                <w:rFonts w:ascii="Arial" w:hAnsi="Arial" w:eastAsia="Arial" w:cs="Arial"/>
+                <w:sz w:val="22"/>
+                <w:szCs w:val="22"/>
+              </w:rPr>
               <w:t xml:space="preserve">Mi utilización de la herramienta de IAG ha </w:t>
             </w:r>
             <w:r>
               <w:rPr>
+                <w:rFonts w:ascii="Arial" w:hAnsi="Arial" w:eastAsia="Arial" w:cs="Arial"/>
                 <w:b/>
+                <w:bCs/>
+                <w:sz w:val="22"/>
+                <w:szCs w:val="22"/>
               </w:rPr>
               <w:t>respetado sus términos de uso</w:t>
             </w:r>
             <w:r>
+              <w:rPr>
+                <w:rFonts w:ascii="Arial" w:hAnsi="Arial" w:eastAsia="Arial" w:cs="Arial"/>
+                <w:sz w:val="22"/>
+                <w:szCs w:val="22"/>
+              </w:rPr>
               <w:t>, así como los principios éticos esenciales, no orientándola de manera maliciosa a obtener un resultado inapropiado para el trabajo presentado, es decir, que produzca una impresión o conocimiento contrario a la realidad de los resultados obtenidos, que suplante mi propio trabajo o que pueda resultar en un perjuicio para las personas</w:t>
             </w:r>
             <w:r>
               <w:rPr>
-                <w:rFonts w:ascii="Cambria" w:eastAsia="Cambria" w:hAnsi="Cambria" w:cs="Cambria"/>
+                <w:rFonts w:ascii="Cambria" w:hAnsi="Cambria" w:eastAsia="Cambria" w:cs="Cambria"/>
                 <w:sz w:val="24"/>
                 <w:szCs w:val="24"/>
               </w:rPr>
@@ -709,7 +987,7 @@
               <w:ind w:left="720"/>
               <w:jc w:val="both"/>
               <w:rPr>
-                <w:rFonts w:ascii="Cambria" w:eastAsia="Cambria" w:hAnsi="Cambria" w:cs="Cambria"/>
+                <w:rFonts w:ascii="Cambria" w:hAnsi="Cambria" w:eastAsia="Cambria" w:cs="Cambria"/>
                 <w:sz w:val="24"/>
                 <w:szCs w:val="24"/>
               </w:rPr>
@@ -724,12 +1002,29 @@
         <w:tc>
           <w:tcPr>
             <w:tcW w:w="4531" w:type="dxa"/>
+            <w:tcBorders>
+              <w:top w:val="single" w:sz="4" w:space="0" w:color="000000"/>
+              <w:left w:val="single" w:sz="4" w:space="0" w:color="000000"/>
+              <w:bottom w:val="single" w:sz="4" w:space="0" w:color="000000"/>
+              <w:right w:val="single" w:sz="4" w:space="0" w:color="000000"/>
+            </w:tcBorders>
+            <w:tcMar>
+              <w:left w:w="108" w:type="dxa"/>
+              <w:right w:w="108" w:type="dxa"/>
+            </w:tcMar>
             <w:vAlign w:val="center"/>
           </w:tcPr>
           <w:p>
+            <w:pPr>
+              <w:spacing w:line="276" w:lineRule="auto"/>
+            </w:pPr>
             <w:r>
               <w:rPr>
+                <w:rFonts w:ascii="Arial" w:hAnsi="Arial" w:eastAsia="Arial" w:cs="Arial"/>
                 <w:b/>
+                <w:bCs/>
+                <w:sz w:val="22"/>
+                <w:szCs w:val="22"/>
               </w:rPr>
               <w:t>[X] SÍ</w:t>
             </w:r>
@@ -738,29 +1033,59 @@
         <w:tc>
           <w:tcPr>
             <w:tcW w:w="4469" w:type="dxa"/>
+            <w:tcBorders>
+              <w:top w:val="single" w:sz="4" w:space="0" w:color="000000"/>
+              <w:left w:val="single" w:sz="4" w:space="0" w:color="000000"/>
+              <w:bottom w:val="single" w:sz="4" w:space="0" w:color="000000"/>
+              <w:right w:val="single" w:sz="4" w:space="0" w:color="000000"/>
+            </w:tcBorders>
+            <w:tcMar>
+              <w:left w:w="108" w:type="dxa"/>
+              <w:right w:w="108" w:type="dxa"/>
+            </w:tcMar>
             <w:vAlign w:val="center"/>
           </w:tcPr>
           <w:p>
+            <w:pPr>
+              <w:spacing w:line="276" w:lineRule="auto"/>
+            </w:pPr>
             <w:r>
-              <w:t>[  ] NO</w:t>
+              <w:rPr>
+                <w:rFonts w:ascii="Arial" w:hAnsi="Arial" w:eastAsia="Arial" w:cs="Arial"/>
+                <w:sz w:val="22"/>
+                <w:szCs w:val="22"/>
+              </w:rPr>
+              <w:t xml:space="preserve">[  ] NO</w:t>
             </w:r>
           </w:p>
         </w:tc>
       </w:tr>
     </w:tbl>
-    <w:p/>
-    <w:p/>
-    <w:p>
-      <w:pPr>
-        <w:shd w:val="clear" w:color="auto" w:fill="D9D9D9"/>
-        <w:jc w:val="both"/>
-        <w:rPr>
-          <w:b/>
-        </w:rPr>
-      </w:pPr>
-      <w:r>
-        <w:rPr>
-          <w:b/>
+    <w:p>
+      <w:pPr>
+        <w:spacing w:line="276" w:lineRule="auto"/>
+      </w:pPr>
+    </w:p>
+    <w:p>
+      <w:pPr>
+        <w:spacing w:line="276" w:lineRule="auto"/>
+      </w:pPr>
+    </w:p>
+    <w:p>
+      <w:pPr>
+        <w:shd w:val="clear" w:fill="D9D9D9"/>
+        <w:jc w:val="both"/>
+        <w:rPr>
+          <w:b/>
+        </w:rPr>
+      </w:pPr>
+      <w:r>
+        <w:rPr>
+          <w:rFonts w:ascii="Arial" w:hAnsi="Arial" w:eastAsia="Arial" w:cs="Arial"/>
+          <w:b/>
+          <w:bCs/>
+          <w:sz w:val="22"/>
+          <w:szCs w:val="22"/>
         </w:rPr>
         <w:t>Parte 2: declaración de uso técnico</w:t>
       </w:r>
@@ -781,11 +1106,20 @@
         </w:rPr>
       </w:pPr>
       <w:r>
+        <w:rPr>
+          <w:rFonts w:ascii="Arial" w:hAnsi="Arial" w:eastAsia="Arial" w:cs="Arial"/>
+          <w:sz w:val="22"/>
+          <w:szCs w:val="22"/>
+        </w:rPr>
         <w:t>Utiliza el siguiente modelo de declaración tantas veces como sea necesario, a fin de reflejar todos los tipos de iteración que has tenido con herramientas de IAG. Incluye un ejemplo por cada tipo de uso realizado donde se indique:</w:t>
       </w:r>
       <w:r>
         <w:rPr>
-          <w:i/>
+          <w:rFonts w:ascii="Arial" w:hAnsi="Arial" w:eastAsia="Arial" w:cs="Arial"/>
+          <w:i/>
+          <w:iCs/>
+          <w:sz w:val="22"/>
+          <w:szCs w:val="22"/>
         </w:rPr>
         <w:t xml:space="preserve"> [Añade un ejemplo].</w:t>
       </w:r>
@@ -807,31 +1141,40 @@
       </w:pPr>
       <w:r>
         <w:rPr>
-          <w:b/>
-        </w:rPr>
-        <w:t>Declaro haber hecho uso del sistema de IAG: Google Gemini (Gemini 2.0 / 1.5 Pro) / Asistente de Codificación Antigravity para:</w:t>
-      </w:r>
-    </w:p>
-    <w:p>
-      <w:pPr>
-        <w:jc w:val="both"/>
-        <w:rPr>
-          <w:b/>
-        </w:rPr>
-      </w:pPr>
-    </w:p>
-    <w:p>
-      <w:pPr>
-        <w:jc w:val="both"/>
-        <w:rPr>
-          <w:b/>
-          <w:i/>
-        </w:rPr>
-      </w:pPr>
-      <w:r>
-        <w:rPr>
-          <w:b/>
-          <w:i/>
+          <w:rFonts w:ascii="Arial" w:hAnsi="Arial" w:eastAsia="Arial" w:cs="Arial"/>
+          <w:b/>
+          <w:bCs/>
+          <w:sz w:val="22"/>
+          <w:szCs w:val="22"/>
+        </w:rPr>
+        <w:t>Declaro haber hecho uso del sistema de IAG: Google Gemini (Antigravity) para:</w:t>
+      </w:r>
+    </w:p>
+    <w:p>
+      <w:pPr>
+        <w:jc w:val="both"/>
+        <w:rPr>
+          <w:b/>
+        </w:rPr>
+      </w:pPr>
+    </w:p>
+    <w:p>
+      <w:pPr>
+        <w:jc w:val="both"/>
+        <w:rPr>
+          <w:b/>
+          <w:i/>
+        </w:rPr>
+      </w:pPr>
+      <w:r>
+        <w:rPr>
+          <w:rFonts w:ascii="Arial" w:hAnsi="Arial" w:eastAsia="Arial" w:cs="Arial"/>
+          <w:b/>
+          <w:bCs/>
+          <w:i/>
+          <w:iCs/>
+          <w:sz w:val="22"/>
+          <w:szCs w:val="22"/>
         </w:rPr>
         <w:t>Documentación y redacción:</w:t>
       </w:r>
@@ -850,38 +1193,76 @@
           <w:ilvl w:val="0"/>
           <w:numId w:val="2"/>
         </w:numPr>
-        <w:shd w:val="clear" w:color="auto" w:fill="FFFFFF"/>
-        <w:jc w:val="both"/>
-        <w:rPr>
-          <w:i/>
-        </w:rPr>
-      </w:pPr>
-      <w:r>
-        <w:rPr>
-          <w:i/>
+        <w:shd w:val="clear" w:fill="FFFFFF"/>
+        <w:ind w:left="720" w:hanging="360"/>
+        <w:jc w:val="both"/>
+        <w:rPr>
+          <w:i/>
+        </w:rPr>
+      </w:pPr>
+      <w:r>
+        <w:rPr>
+          <w:rFonts w:ascii="Arial" w:hAnsi="Arial" w:eastAsia="Arial" w:cs="Arial"/>
+          <w:i/>
+          <w:iCs/>
+          <w:sz w:val="22"/>
+          <w:szCs w:val="22"/>
         </w:rPr>
         <w:t>Soporte a la reflexión en relación con el desarrollo del trabajo: proceso iterativo de análisis de alternativas y enfoques utilizando la IAG</w:t>
       </w:r>
     </w:p>
     <w:p>
       <w:pPr>
-        <w:shd w:val="clear" w:color="auto" w:fill="FFFFFF"/>
-        <w:jc w:val="both"/>
-        <w:rPr>
-          <w:i/>
-        </w:rPr>
-      </w:pPr>
-      <w:r>
+        <w:shd w:val="clear" w:fill="FFFFFF"/>
+        <w:ind w:left="720" w:hanging="360"/>
+        <w:jc w:val="both"/>
+        <w:rPr>
+          <w:i/>
+        </w:rPr>
+      </w:pPr>
+    </w:p>
+    <w:p>
+      <w:pPr>
+        <w:shd w:val="clear" w:fill="FFFFFF"/>
+        <w:jc w:val="both"/>
+        <w:rPr>
+          <w:i/>
+        </w:rPr>
+      </w:pPr>
+      <w:r>
+        <w:rPr>
+          <w:rFonts w:ascii="Arial" w:hAnsi="Arial" w:eastAsia="Arial" w:cs="Arial"/>
+          <w:sz w:val="22"/>
+          <w:szCs w:val="22"/>
+        </w:rPr>
         <w:t>Ejemplo de uso: Se solicitó soporte analítico para evaluar y comparar las alternativas algorítmicas de búsqueda (metaheurísticas bioinspiradas ACO, ABC y BHA frente a baselines exhaustivos Lawnmower y espirales) bajo restricciones estrictas de autonomía de batería en drones SAR.</w:t>
-        <w:br/>
+      </w:r>
+      <w:r>
+        <w:br w:type="textWrapping"/>
+      </w:r>
+      <w:r>
+        <w:rPr>
+          <w:rFonts w:ascii="Arial" w:hAnsi="Arial" w:eastAsia="Arial" w:cs="Arial"/>
+          <w:sz w:val="22"/>
+          <w:szCs w:val="22"/>
+        </w:rPr>
         <w:t>- Prompt: "Analiza las fortalezas y debilidades de los algoritmos ACO, ABC y BHA frente a patrones geométricos en búsqueda SAR con horizonte temporal limitado."</w:t>
-        <w:br/>
+      </w:r>
+      <w:r>
+        <w:br w:type="textWrapping"/>
+      </w:r>
+      <w:r>
+        <w:rPr>
+          <w:rFonts w:ascii="Arial" w:hAnsi="Arial" w:eastAsia="Arial" w:cs="Arial"/>
+          <w:sz w:val="22"/>
+          <w:szCs w:val="22"/>
+        </w:rPr>
         <w:t>- Interacción: Selección fundamentada de la matriz de 6 algoritmos para el benchmark de 900 simulaciones de Montecarlo.</w:t>
       </w:r>
     </w:p>
     <w:p>
       <w:pPr>
-        <w:shd w:val="clear" w:color="auto" w:fill="FFFFFF"/>
+        <w:shd w:val="clear" w:fill="FFFFFF"/>
         <w:ind w:left="1440"/>
         <w:jc w:val="both"/>
         <w:rPr>
@@ -890,122 +1271,50 @@
         </w:rPr>
       </w:pPr>
       <w:r>
-        <w:rPr>
-          <w:noProof/>
-        </w:rPr>
-        <mc:AlternateContent>
-          <mc:Choice Requires="wps">
-            <w:drawing>
-              <wp:anchor distT="0" distB="0" distL="114300" distR="114300" simplePos="0" relativeHeight="251658240" behindDoc="0" locked="0" layoutInCell="1" hidden="0" allowOverlap="1" wp14:anchorId="37CAA250" wp14:editId="73C19912">
-                <wp:simplePos x="0" y="0"/>
-                <wp:positionH relativeFrom="column">
-                  <wp:posOffset>-12699</wp:posOffset>
-                </wp:positionH>
-                <wp:positionV relativeFrom="paragraph">
-                  <wp:posOffset>12700</wp:posOffset>
-                </wp:positionV>
-                <wp:extent cx="5848350" cy="1457325"/>
-                <wp:effectExtent l="0" t="0" r="0" b="0"/>
-                <wp:wrapNone/>
-                <wp:docPr id="22" name="Rectángulo 22"/>
-                <wp:cNvGraphicFramePr/>
-                <a:graphic xmlns:a="http://schemas.openxmlformats.org/drawingml/2006/main">
-                  <a:graphicData uri="http://schemas.microsoft.com/office/word/2010/wordprocessingShape">
-                    <wps:wsp>
-                      <wps:cNvSpPr/>
-                      <wps:spPr>
-                        <a:xfrm>
-                          <a:off x="2431350" y="3056100"/>
-                          <a:ext cx="5829300" cy="1434000"/>
-                        </a:xfrm>
-                        <a:prstGeom prst="rect">
-                          <a:avLst/>
-                        </a:prstGeom>
-                        <a:solidFill>
-                          <a:schemeClr val="lt1"/>
-                        </a:solidFill>
-                        <a:ln w="9525" cap="flat" cmpd="sng">
-                          <a:solidFill>
-                            <a:srgbClr val="000000"/>
-                          </a:solidFill>
-                          <a:prstDash val="solid"/>
-                          <a:round/>
-                          <a:headEnd type="none" w="sm" len="sm"/>
-                          <a:tailEnd type="none" w="sm" len="sm"/>
-                        </a:ln>
-                      </wps:spPr>
-                      <wps:txbx>
-                        <w:txbxContent>
-                          <w:p>
-                            <w:pPr>
-                              <w:spacing w:line="274" w:lineRule="auto"/>
-                              <w:jc w:val="both"/>
-                              <w:textDirection w:val="btLr"/>
-                            </w:pPr>
-                            <w:r>
-                              <w:rPr>
-                                <w:i/>
-                                <w:color w:val="CC0000"/>
-                              </w:rPr>
-                              <w:t xml:space="preserve">[Añade un ejemplo] </w:t>
-                            </w:r>
-                            <w:r>
-                              <w:rPr>
-                                <w:i/>
-                                <w:color w:val="38761D"/>
-                              </w:rPr>
-                              <w:t>Por ejemplo: He solicitado una lista de alternativas para abordar el problema planteado al inicio del trabajo.</w:t>
-                            </w:r>
-                          </w:p>
-                        </w:txbxContent>
-                      </wps:txbx>
-                      <wps:bodyPr spcFirstLastPara="1" wrap="square" lIns="91425" tIns="45700" rIns="91425" bIns="45700" anchor="t" anchorCtr="0">
-                        <a:noAutofit/>
-                      </wps:bodyPr>
-                    </wps:wsp>
-                  </a:graphicData>
-                </a:graphic>
-              </wp:anchor>
-            </w:drawing>
-          </mc:Choice>
-          <mc:Fallback>
-            <w:pict>
-              <v:rect w14:anchorId="37CAA250" id="Rectángulo 22" o:spid="_x0000_s1026" style="position:absolute;left:0;text-align:left;margin-left:-1pt;margin-top:1pt;width:460.5pt;height:114.75pt;z-index:251658240;visibility:visible;mso-wrap-style:square;mso-wrap-distance-left:9pt;mso-wrap-distance-top:0;mso-wrap-distance-right:9pt;mso-wrap-distance-bottom:0;mso-position-horizontal:absolute;mso-position-horizontal-relative:text;mso-position-vertical:absolute;mso-position-vertical-relative:text;v-text-anchor:top" o:gfxdata="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" fillcolor="white [3201]">
-                <v:stroke startarrowwidth="narrow" startarrowlength="short" endarrowwidth="narrow" endarrowlength="short" joinstyle="round"/>
-                <v:textbox inset="2.53958mm,1.2694mm,2.53958mm,1.2694mm">
-                  <w:txbxContent>
-                    <w:p>
-                      <w:pPr>
-                        <w:spacing w:line="274" w:lineRule="auto"/>
-                        <w:jc w:val="both"/>
-                        <w:textDirection w:val="btLr"/>
-                      </w:pPr>
-                      <w:r>
-                        <w:rPr>
-                          <w:i/>
-                          <w:color w:val="CC0000"/>
-                        </w:rPr>
-                        <w:t xml:space="preserve">[Añade un ejemplo] </w:t>
-                      </w:r>
-                      <w:r>
-                        <w:rPr>
-                          <w:i/>
-                          <w:color w:val="38761D"/>
-                        </w:rPr>
-                        <w:t>Por ejemplo: He solicitado una lista de alternativas para abordar el problema planteado al inicio del trabajo.</w:t>
-                      </w:r>
-                    </w:p>
-                  </w:txbxContent>
-                </v:textbox>
-              </v:rect>
-            </w:pict>
-          </mc:Fallback>
-        </mc:AlternateContent>
-      </w:r>
-    </w:p>
-    <w:p>
-      <w:pPr>
-        <w:shd w:val="clear" w:color="auto" w:fill="FFFFFF"/>
+        <w:drawing>
+          <wp:anchor distT="0" distB="0" distL="114300" distR="114300" simplePos="0" relativeHeight="251658240" behindDoc="0" locked="0" layoutInCell="1" allowOverlap="1">
+            <wp:simplePos x="0" y="0"/>
+            <wp:positionH relativeFrom="column">
+              <wp:posOffset>-12699</wp:posOffset>
+            </wp:positionH>
+            <wp:positionV relativeFrom="paragraph">
+              <wp:posOffset>12700</wp:posOffset>
+            </wp:positionV>
+            <wp:extent cx="5848350" cy="1457325"/>
+            <wp:effectExtent l="0" t="0" r="0" b="0"/>
+            <wp:wrapNone/>
+            <wp:docPr id="22" name="Shape 22"/>
+            <wp:cNvGraphicFramePr/>
+            <a:graphic xmlns:a="http://schemas.openxmlformats.org/drawingml/2006/main">
+              <a:graphicData uri="http://schemas.microsoft.com/office/word/2010/wordprocessingShape">
+                <wps:wsp>
+                  <wps:cNvSpPr/>
+                  <wps:spPr>
+                    <a:xfrm>
+                      <a:off x="0" y="0"/>
+                      <a:ext cx="5848350" cy="1457325"/>
+                    </a:xfrm>
+                    <a:prstGeom prst="rect">
+                      <a:avLst/>
+                    </a:prstGeom>
+                    <a:noFill/>
+                    <a:ln w="9525">
+                      <a:solidFill>
+                        <a:srgbClr val="000000"/>
+                      </a:solidFill>
+                    </a:ln>
+                  </wps:spPr>
+                  <wps:bodyPr rot="0" vert="horz" lIns="95250" tIns="47625" rIns="95250" bIns="47625"/>
+                </wps:wsp>
+              </a:graphicData>
+            </a:graphic>
+          </wp:anchor>
+        </w:drawing>
+      </w:r>
+    </w:p>
+    <w:p>
+      <w:pPr>
+        <w:shd w:val="clear" w:fill="FFFFFF"/>
         <w:ind w:left="1440"/>
         <w:jc w:val="both"/>
         <w:rPr>
@@ -1016,18 +1325,17 @@
     </w:p>
     <w:p>
       <w:pPr>
-        <w:shd w:val="clear" w:color="auto" w:fill="FFFFFF"/>
+        <w:shd w:val="clear" w:fill="FFFFFF"/>
         <w:ind w:left="1440"/>
         <w:jc w:val="both"/>
         <w:rPr>
           <w:i/>
-          <w:color w:val="CC0000"/>
-        </w:rPr>
-      </w:pPr>
-    </w:p>
-    <w:p>
-      <w:pPr>
-        <w:shd w:val="clear" w:color="auto" w:fill="FFFFFF"/>
+        </w:rPr>
+      </w:pPr>
+    </w:p>
+    <w:p>
+      <w:pPr>
+        <w:shd w:val="clear" w:fill="FFFFFF"/>
         <w:ind w:left="1440"/>
         <w:jc w:val="both"/>
         <w:rPr>
@@ -1037,7 +1345,7 @@
     </w:p>
     <w:p>
       <w:pPr>
-        <w:shd w:val="clear" w:color="auto" w:fill="FFFFFF"/>
+        <w:shd w:val="clear" w:fill="FFFFFF"/>
         <w:ind w:left="1440"/>
         <w:jc w:val="both"/>
         <w:rPr>
@@ -1047,7 +1355,7 @@
     </w:p>
     <w:p>
       <w:pPr>
-        <w:shd w:val="clear" w:color="auto" w:fill="FFFFFF"/>
+        <w:shd w:val="clear" w:fill="FFFFFF"/>
         <w:ind w:left="1440"/>
         <w:jc w:val="both"/>
         <w:rPr>
@@ -1057,138 +1365,142 @@
     </w:p>
     <w:p>
       <w:pPr>
-        <w:shd w:val="clear" w:color="auto" w:fill="FFFFFF"/>
-        <w:ind w:left="1440"/>
-        <w:jc w:val="both"/>
-        <w:rPr>
-          <w:i/>
-        </w:rPr>
-      </w:pPr>
-    </w:p>
-    <w:p>
-      <w:pPr>
-        <w:shd w:val="clear" w:color="auto" w:fill="FFFFFF"/>
-        <w:ind w:left="1440"/>
-        <w:jc w:val="both"/>
-        <w:rPr>
-          <w:i/>
-        </w:rPr>
-      </w:pPr>
-    </w:p>
-    <w:p>
-      <w:pPr>
-        <w:shd w:val="clear" w:color="auto" w:fill="FFFFFF"/>
-        <w:jc w:val="both"/>
-        <w:rPr>
-          <w:i/>
-        </w:rPr>
-      </w:pPr>
-    </w:p>
-    <w:p>
-      <w:pPr>
+        <w:spacing w:line="276" w:lineRule="auto"/>
+      </w:pPr>
+    </w:p>
+    <w:p>
+      <w:pPr>
+        <w:pageBreakBefore/>
         <w:numPr>
           <w:ilvl w:val="0"/>
           <w:numId w:val="2"/>
         </w:numPr>
-        <w:shd w:val="clear" w:color="auto" w:fill="FFFFFF"/>
-        <w:jc w:val="both"/>
-        <w:rPr>
-          <w:i/>
-        </w:rPr>
-      </w:pPr>
-      <w:r>
-        <w:br w:type="page"/>
-      </w:r>
-      <w:r>
-        <w:rPr>
-          <w:i/>
-        </w:rPr>
+        <w:shd w:val="clear" w:fill="FFFFFF"/>
+        <w:ind w:left="720" w:hanging="360"/>
+        <w:jc w:val="both"/>
+        <w:rPr>
+          <w:i/>
+        </w:rPr>
+      </w:pPr>
+      <w:r>
         <w:lastRenderedPageBreak/>
+      </w:r>
+      <w:r>
+        <w:rPr>
+          <w:rFonts w:ascii="Arial" w:hAnsi="Arial" w:eastAsia="Arial" w:cs="Arial"/>
+          <w:i/>
+          <w:iCs/>
+          <w:sz w:val="22"/>
+          <w:szCs w:val="22"/>
+        </w:rPr>
         <w:t>Revisión o reescritura de párrafos redactados previamente</w:t>
       </w:r>
     </w:p>
     <w:p>
       <w:pPr>
-        <w:shd w:val="clear" w:color="auto" w:fill="FFFFFF"/>
-        <w:jc w:val="both"/>
-        <w:rPr>
-          <w:i/>
-        </w:rPr>
-      </w:pPr>
-      <w:r>
+        <w:shd w:val="clear" w:fill="FFFFFF"/>
+        <w:jc w:val="both"/>
+        <w:rPr>
+          <w:i/>
+        </w:rPr>
+      </w:pPr>
+      <w:r>
+        <w:rPr>
+          <w:rFonts w:ascii="Arial" w:hAnsi="Arial" w:eastAsia="Arial" w:cs="Arial"/>
+          <w:sz w:val="22"/>
+          <w:szCs w:val="22"/>
+        </w:rPr>
         <w:t>Ejemplo de uso: Se utilizó la herramienta para revisar el estilo académico formal en español y la sintaxis LaTeX de las fórmulas matemáticas y tablas del documento.</w:t>
-        <w:br/>
-        <w:t>- Prompt: "Revisa la redacción formal de la justificación técnica de la búsqueda coordinada en el perfil autista manteniendo el vocabulario estándar de operaciones SAR."</w:t>
-        <w:br/>
+      </w:r>
+      <w:r>
+        <w:br w:type="textWrapping"/>
+      </w:r>
+      <w:r>
+        <w:rPr>
+          <w:rFonts w:ascii="Arial" w:hAnsi="Arial" w:eastAsia="Arial" w:cs="Arial"/>
+          <w:sz w:val="22"/>
+          <w:szCs w:val="22"/>
+        </w:rPr>
+        <w:t>- Prompt: "Revisa la redacción de la justificación técnica de la búsqueda coordinada en el perfil autista manteniendo el vocabulario de operaciones SAR."</w:t>
+      </w:r>
+      <w:r>
+        <w:br w:type="textWrapping"/>
+      </w:r>
+      <w:r>
+        <w:rPr>
+          <w:rFonts w:ascii="Arial" w:hAnsi="Arial" w:eastAsia="Arial" w:cs="Arial"/>
+          <w:sz w:val="22"/>
+          <w:szCs w:val="22"/>
+        </w:rPr>
         <w:t>- Interacción: Incorporación de la redacción supervisada en el Capítulo 3 de la memoria.</w:t>
       </w:r>
     </w:p>
     <w:p>
       <w:pPr>
-        <w:shd w:val="clear" w:color="auto" w:fill="FFFFFF"/>
-        <w:jc w:val="both"/>
-        <w:rPr>
-          <w:i/>
-        </w:rPr>
-      </w:pPr>
-    </w:p>
-    <w:p>
-      <w:pPr>
-        <w:shd w:val="clear" w:color="auto" w:fill="FFFFFF"/>
-        <w:jc w:val="both"/>
-        <w:rPr>
-          <w:i/>
-        </w:rPr>
-      </w:pPr>
-    </w:p>
-    <w:p>
-      <w:pPr>
-        <w:shd w:val="clear" w:color="auto" w:fill="FFFFFF"/>
-        <w:jc w:val="both"/>
-        <w:rPr>
-          <w:i/>
-        </w:rPr>
-      </w:pPr>
-    </w:p>
-    <w:p>
-      <w:pPr>
-        <w:shd w:val="clear" w:color="auto" w:fill="FFFFFF"/>
-        <w:jc w:val="both"/>
-        <w:rPr>
-          <w:i/>
-        </w:rPr>
-      </w:pPr>
-    </w:p>
-    <w:p>
-      <w:pPr>
-        <w:shd w:val="clear" w:color="auto" w:fill="FFFFFF"/>
-        <w:jc w:val="both"/>
-        <w:rPr>
-          <w:i/>
-        </w:rPr>
-      </w:pPr>
-    </w:p>
-    <w:p>
-      <w:pPr>
-        <w:shd w:val="clear" w:color="auto" w:fill="FFFFFF"/>
-        <w:jc w:val="both"/>
-        <w:rPr>
-          <w:i/>
-        </w:rPr>
-      </w:pPr>
-    </w:p>
-    <w:p>
-      <w:pPr>
-        <w:shd w:val="clear" w:color="auto" w:fill="FFFFFF"/>
-        <w:jc w:val="both"/>
-        <w:rPr>
-          <w:i/>
-        </w:rPr>
-      </w:pPr>
-    </w:p>
-    <w:p>
-      <w:pPr>
-        <w:shd w:val="clear" w:color="auto" w:fill="FFFFFF"/>
+        <w:shd w:val="clear" w:fill="FFFFFF"/>
+        <w:jc w:val="both"/>
+        <w:rPr>
+          <w:i/>
+        </w:rPr>
+      </w:pPr>
+    </w:p>
+    <w:p>
+      <w:pPr>
+        <w:shd w:val="clear" w:fill="FFFFFF"/>
+        <w:jc w:val="both"/>
+        <w:rPr>
+          <w:i/>
+        </w:rPr>
+      </w:pPr>
+    </w:p>
+    <w:p>
+      <w:pPr>
+        <w:shd w:val="clear" w:fill="FFFFFF"/>
+        <w:jc w:val="both"/>
+        <w:rPr>
+          <w:i/>
+        </w:rPr>
+      </w:pPr>
+    </w:p>
+    <w:p>
+      <w:pPr>
+        <w:shd w:val="clear" w:fill="FFFFFF"/>
+        <w:jc w:val="both"/>
+        <w:rPr>
+          <w:i/>
+        </w:rPr>
+      </w:pPr>
+    </w:p>
+    <w:p>
+      <w:pPr>
+        <w:shd w:val="clear" w:fill="FFFFFF"/>
+        <w:jc w:val="both"/>
+        <w:rPr>
+          <w:i/>
+        </w:rPr>
+      </w:pPr>
+    </w:p>
+    <w:p>
+      <w:pPr>
+        <w:shd w:val="clear" w:fill="FFFFFF"/>
+        <w:jc w:val="both"/>
+        <w:rPr>
+          <w:i/>
+        </w:rPr>
+      </w:pPr>
+    </w:p>
+    <w:p>
+      <w:pPr>
+        <w:shd w:val="clear" w:fill="FFFFFF"/>
+        <w:jc w:val="both"/>
+        <w:rPr>
+          <w:i/>
+        </w:rPr>
+      </w:pPr>
+    </w:p>
+    <w:p>
+      <w:pPr>
+        <w:shd w:val="clear" w:fill="FFFFFF"/>
         <w:jc w:val="both"/>
         <w:rPr>
           <w:i/>
@@ -1201,101 +1513,129 @@
           <w:ilvl w:val="0"/>
           <w:numId w:val="2"/>
         </w:numPr>
-        <w:shd w:val="clear" w:color="auto" w:fill="FFFFFF"/>
-        <w:jc w:val="both"/>
-        <w:rPr>
-          <w:i/>
-        </w:rPr>
-      </w:pPr>
-      <w:r>
-        <w:rPr>
-          <w:i/>
+        <w:shd w:val="clear" w:fill="FFFFFF"/>
+        <w:ind w:left="720" w:hanging="360"/>
+        <w:jc w:val="both"/>
+        <w:rPr>
+          <w:i/>
+        </w:rPr>
+      </w:pPr>
+      <w:r>
+        <w:rPr>
+          <w:rFonts w:ascii="Arial" w:hAnsi="Arial" w:eastAsia="Arial" w:cs="Arial"/>
+          <w:i/>
+          <w:iCs/>
+          <w:sz w:val="22"/>
+          <w:szCs w:val="22"/>
         </w:rPr>
         <w:t>Búsqueda de información o respuesta a preguntas concretas</w:t>
       </w:r>
     </w:p>
     <w:p>
       <w:pPr>
-        <w:shd w:val="clear" w:color="auto" w:fill="FFFFFF"/>
-        <w:jc w:val="both"/>
-        <w:rPr>
-          <w:i/>
-        </w:rPr>
-      </w:pPr>
-      <w:r>
+        <w:shd w:val="clear" w:fill="FFFFFF"/>
+        <w:jc w:val="both"/>
+        <w:rPr>
+          <w:i/>
+        </w:rPr>
+      </w:pPr>
+      <w:r>
+        <w:rPr>
+          <w:rFonts w:ascii="Arial" w:hAnsi="Arial" w:eastAsia="Arial" w:cs="Arial"/>
+          <w:sz w:val="22"/>
+          <w:szCs w:val="22"/>
+        </w:rPr>
         <w:t>Ejemplo de uso: Consultas técnicas sobre estándares de representación cartográfica OpenStreetMap (OSM) y modelado de dispersión estadística Lost Person Behavior (LPB).</w:t>
-        <w:br/>
+      </w:r>
+      <w:r>
+        <w:br w:type="textWrapping"/>
+      </w:r>
+      <w:r>
+        <w:rPr>
+          <w:rFonts w:ascii="Arial" w:hAnsi="Arial" w:eastAsia="Arial" w:cs="Arial"/>
+          <w:sz w:val="22"/>
+          <w:szCs w:val="22"/>
+        </w:rPr>
         <w:t>- Prompt: "¿Cuáles son las capas semánticas de OpenStreetMap más relevantes para modelar la movilidad de personas extraviadas según la categorización de Robert Koester?"</w:t>
-        <w:br/>
+      </w:r>
+      <w:r>
+        <w:br w:type="textWrapping"/>
+      </w:r>
+      <w:r>
+        <w:rPr>
+          <w:rFonts w:ascii="Arial" w:hAnsi="Arial" w:eastAsia="Arial" w:cs="Arial"/>
+          <w:sz w:val="22"/>
+          <w:szCs w:val="22"/>
+        </w:rPr>
         <w:t>- Interacción: Definición de las 6 capas del suelo (caminos, bosques, estructuras, agua, campos, matorral) empleadas en SAREnv.</w:t>
       </w:r>
     </w:p>
     <w:p>
       <w:pPr>
-        <w:shd w:val="clear" w:color="auto" w:fill="FFFFFF"/>
-        <w:jc w:val="both"/>
-        <w:rPr>
-          <w:i/>
-        </w:rPr>
-      </w:pPr>
-    </w:p>
-    <w:p>
-      <w:pPr>
-        <w:shd w:val="clear" w:color="auto" w:fill="FFFFFF"/>
-        <w:jc w:val="both"/>
-        <w:rPr>
-          <w:i/>
-        </w:rPr>
-      </w:pPr>
-    </w:p>
-    <w:p>
-      <w:pPr>
-        <w:shd w:val="clear" w:color="auto" w:fill="FFFFFF"/>
-        <w:jc w:val="both"/>
-        <w:rPr>
-          <w:i/>
-        </w:rPr>
-      </w:pPr>
-    </w:p>
-    <w:p>
-      <w:pPr>
-        <w:shd w:val="clear" w:color="auto" w:fill="FFFFFF"/>
-        <w:jc w:val="both"/>
-        <w:rPr>
-          <w:i/>
-        </w:rPr>
-      </w:pPr>
-    </w:p>
-    <w:p>
-      <w:pPr>
-        <w:shd w:val="clear" w:color="auto" w:fill="FFFFFF"/>
-        <w:jc w:val="both"/>
-        <w:rPr>
-          <w:i/>
-        </w:rPr>
-      </w:pPr>
-    </w:p>
-    <w:p>
-      <w:pPr>
-        <w:shd w:val="clear" w:color="auto" w:fill="FFFFFF"/>
-        <w:jc w:val="both"/>
-        <w:rPr>
-          <w:i/>
-        </w:rPr>
-      </w:pPr>
-    </w:p>
-    <w:p>
-      <w:pPr>
-        <w:shd w:val="clear" w:color="auto" w:fill="FFFFFF"/>
-        <w:jc w:val="both"/>
-        <w:rPr>
-          <w:i/>
-        </w:rPr>
-      </w:pPr>
-    </w:p>
-    <w:p>
-      <w:pPr>
-        <w:shd w:val="clear" w:color="auto" w:fill="FFFFFF"/>
+        <w:shd w:val="clear" w:fill="FFFFFF"/>
+        <w:jc w:val="both"/>
+        <w:rPr>
+          <w:i/>
+        </w:rPr>
+      </w:pPr>
+    </w:p>
+    <w:p>
+      <w:pPr>
+        <w:shd w:val="clear" w:fill="FFFFFF"/>
+        <w:jc w:val="both"/>
+        <w:rPr>
+          <w:i/>
+        </w:rPr>
+      </w:pPr>
+    </w:p>
+    <w:p>
+      <w:pPr>
+        <w:shd w:val="clear" w:fill="FFFFFF"/>
+        <w:jc w:val="both"/>
+        <w:rPr>
+          <w:i/>
+        </w:rPr>
+      </w:pPr>
+    </w:p>
+    <w:p>
+      <w:pPr>
+        <w:shd w:val="clear" w:fill="FFFFFF"/>
+        <w:jc w:val="both"/>
+        <w:rPr>
+          <w:i/>
+        </w:rPr>
+      </w:pPr>
+    </w:p>
+    <w:p>
+      <w:pPr>
+        <w:shd w:val="clear" w:fill="FFFFFF"/>
+        <w:jc w:val="both"/>
+        <w:rPr>
+          <w:i/>
+        </w:rPr>
+      </w:pPr>
+    </w:p>
+    <w:p>
+      <w:pPr>
+        <w:shd w:val="clear" w:fill="FFFFFF"/>
+        <w:jc w:val="both"/>
+        <w:rPr>
+          <w:i/>
+        </w:rPr>
+      </w:pPr>
+    </w:p>
+    <w:p>
+      <w:pPr>
+        <w:shd w:val="clear" w:fill="FFFFFF"/>
+        <w:jc w:val="both"/>
+        <w:rPr>
+          <w:i/>
+        </w:rPr>
+      </w:pPr>
+    </w:p>
+    <w:p>
+      <w:pPr>
+        <w:shd w:val="clear" w:fill="FFFFFF"/>
         <w:jc w:val="both"/>
         <w:rPr>
           <w:i/>
@@ -1308,15 +1648,20 @@
           <w:ilvl w:val="0"/>
           <w:numId w:val="2"/>
         </w:numPr>
-        <w:shd w:val="clear" w:color="auto" w:fill="FFFFFF"/>
-        <w:jc w:val="both"/>
-        <w:rPr>
-          <w:i/>
-        </w:rPr>
-      </w:pPr>
-      <w:r>
-        <w:rPr>
-          <w:i/>
+        <w:shd w:val="clear" w:fill="FFFFFF"/>
+        <w:ind w:left="720" w:hanging="360"/>
+        <w:jc w:val="both"/>
+        <w:rPr>
+          <w:i/>
+        </w:rPr>
+      </w:pPr>
+      <w:r>
+        <w:rPr>
+          <w:rFonts w:ascii="Arial" w:hAnsi="Arial" w:eastAsia="Arial" w:cs="Arial"/>
+          <w:i/>
+          <w:iCs/>
+          <w:sz w:val="22"/>
+          <w:szCs w:val="22"/>
         </w:rPr>
         <w:t>Búsqueda de bibliografía</w:t>
       </w:r>
@@ -1327,15 +1672,20 @@
           <w:ilvl w:val="0"/>
           <w:numId w:val="2"/>
         </w:numPr>
-        <w:shd w:val="clear" w:color="auto" w:fill="FFFFFF"/>
-        <w:jc w:val="both"/>
-        <w:rPr>
-          <w:i/>
-        </w:rPr>
-      </w:pPr>
-      <w:r>
-        <w:rPr>
-          <w:i/>
+        <w:shd w:val="clear" w:fill="FFFFFF"/>
+        <w:ind w:left="720" w:hanging="360"/>
+        <w:jc w:val="both"/>
+        <w:rPr>
+          <w:i/>
+        </w:rPr>
+      </w:pPr>
+      <w:r>
+        <w:rPr>
+          <w:rFonts w:ascii="Arial" w:hAnsi="Arial" w:eastAsia="Arial" w:cs="Arial"/>
+          <w:i/>
+          <w:iCs/>
+          <w:sz w:val="22"/>
+          <w:szCs w:val="22"/>
         </w:rPr>
         <w:t>Resumen de bibliografía consultada</w:t>
       </w:r>
@@ -1346,22 +1696,27 @@
           <w:ilvl w:val="0"/>
           <w:numId w:val="2"/>
         </w:numPr>
-        <w:shd w:val="clear" w:color="auto" w:fill="FFFFFF"/>
-        <w:jc w:val="both"/>
-        <w:rPr>
-          <w:i/>
-        </w:rPr>
-      </w:pPr>
-      <w:r>
-        <w:rPr>
-          <w:i/>
-        </w:rPr>
-        <w:t xml:space="preserve">Traducción de texto consultados </w:t>
-      </w:r>
-    </w:p>
-    <w:p>
-      <w:pPr>
-        <w:shd w:val="clear" w:color="auto" w:fill="FFFFFF"/>
+        <w:shd w:val="clear" w:fill="FFFFFF"/>
+        <w:ind w:left="720" w:hanging="360"/>
+        <w:jc w:val="both"/>
+        <w:rPr>
+          <w:i/>
+        </w:rPr>
+      </w:pPr>
+      <w:r>
+        <w:rPr>
+          <w:rFonts w:ascii="Arial" w:hAnsi="Arial" w:eastAsia="Arial" w:cs="Arial"/>
+          <w:i/>
+          <w:iCs/>
+          <w:sz w:val="22"/>
+          <w:szCs w:val="22"/>
+        </w:rPr>
+        <w:t xml:space="preserve">Traducción de texto consultado </w:t>
+      </w:r>
+    </w:p>
+    <w:p>
+      <w:pPr>
+        <w:shd w:val="clear" w:fill="FFFFFF"/>
         <w:ind w:left="1440"/>
         <w:jc w:val="both"/>
         <w:rPr>
@@ -1372,67 +1727,88 @@
     </w:p>
     <w:p>
       <w:pPr>
-        <w:shd w:val="clear" w:color="auto" w:fill="FFFFFF"/>
-        <w:jc w:val="both"/>
-        <w:rPr>
-          <w:b/>
-          <w:i/>
-        </w:rPr>
-      </w:pPr>
-      <w:r>
-        <w:rPr>
-          <w:b/>
-          <w:i/>
+        <w:shd w:val="clear" w:fill="FFFFFF"/>
+        <w:jc w:val="both"/>
+        <w:rPr>
+          <w:b/>
+          <w:i/>
+        </w:rPr>
+      </w:pPr>
+      <w:r>
+        <w:rPr>
+          <w:rFonts w:ascii="Arial" w:hAnsi="Arial" w:eastAsia="Arial" w:cs="Arial"/>
+          <w:b/>
+          <w:bCs/>
+          <w:i/>
+          <w:iCs/>
+          <w:sz w:val="22"/>
+          <w:szCs w:val="22"/>
         </w:rPr>
         <w:t xml:space="preserve"> Desarrollar contenido específico </w:t>
       </w:r>
     </w:p>
     <w:p>
       <w:pPr>
-        <w:shd w:val="clear" w:color="auto" w:fill="FFFFFF"/>
-        <w:jc w:val="both"/>
-        <w:rPr>
-          <w:b/>
-          <w:i/>
-        </w:rPr>
-      </w:pPr>
-    </w:p>
-    <w:p>
-      <w:pPr>
-        <w:shd w:val="clear" w:color="auto" w:fill="FFFFFF"/>
-        <w:jc w:val="both"/>
-        <w:rPr>
-          <w:i/>
-        </w:rPr>
-      </w:pPr>
-      <w:r>
-        <w:rPr>
-          <w:i/>
+        <w:shd w:val="clear" w:fill="FFFFFF"/>
+        <w:jc w:val="both"/>
+        <w:rPr>
+          <w:b/>
+          <w:i/>
+        </w:rPr>
+      </w:pPr>
+    </w:p>
+    <w:p>
+      <w:pPr>
+        <w:shd w:val="clear" w:fill="FFFFFF"/>
+        <w:jc w:val="both"/>
+        <w:rPr>
+          <w:i/>
+        </w:rPr>
+      </w:pPr>
+      <w:r>
+        <w:rPr>
+          <w:rFonts w:ascii="Arial" w:hAnsi="Arial" w:eastAsia="Arial" w:cs="Arial"/>
+          <w:i/>
+          <w:iCs/>
+          <w:sz w:val="22"/>
+          <w:szCs w:val="22"/>
         </w:rPr>
         <w:t>Se ha hecho uso de IAG como herramienta de soporte para el desarrollo del contenido específico de</w:t>
       </w:r>
       <w:r>
         <w:rPr>
-          <w:i/>
+          <w:rFonts w:ascii="Arial" w:hAnsi="Arial" w:eastAsia="Arial" w:cs="Arial"/>
+          <w:i/>
+          <w:iCs/>
+          <w:sz w:val="22"/>
+          <w:szCs w:val="22"/>
         </w:rPr>
         <w:t>l TF</w:t>
       </w:r>
       <w:r>
         <w:rPr>
-          <w:i/>
+          <w:rFonts w:ascii="Arial" w:hAnsi="Arial" w:eastAsia="Arial" w:cs="Arial"/>
+          <w:i/>
+          <w:iCs/>
+          <w:sz w:val="22"/>
+          <w:szCs w:val="22"/>
         </w:rPr>
         <w:t>M</w:t>
       </w:r>
       <w:r>
         <w:rPr>
-          <w:i/>
+          <w:rFonts w:ascii="Arial" w:hAnsi="Arial" w:eastAsia="Arial" w:cs="Arial"/>
+          <w:i/>
+          <w:iCs/>
+          <w:sz w:val="22"/>
+          <w:szCs w:val="22"/>
         </w:rPr>
         <w:t>, incluyendo:</w:t>
       </w:r>
     </w:p>
     <w:p>
       <w:pPr>
-        <w:shd w:val="clear" w:color="auto" w:fill="FFFFFF"/>
+        <w:shd w:val="clear" w:fill="FFFFFF"/>
         <w:jc w:val="both"/>
         <w:rPr>
           <w:i/>
@@ -1445,101 +1821,129 @@
           <w:ilvl w:val="0"/>
           <w:numId w:val="2"/>
         </w:numPr>
-        <w:shd w:val="clear" w:color="auto" w:fill="FFFFFF"/>
-        <w:jc w:val="both"/>
-        <w:rPr>
-          <w:i/>
-        </w:rPr>
-      </w:pPr>
-      <w:r>
-        <w:rPr>
-          <w:i/>
+        <w:shd w:val="clear" w:fill="FFFFFF"/>
+        <w:ind w:left="720" w:hanging="360"/>
+        <w:jc w:val="both"/>
+        <w:rPr>
+          <w:i/>
+        </w:rPr>
+      </w:pPr>
+      <w:r>
+        <w:rPr>
+          <w:rFonts w:ascii="Arial" w:hAnsi="Arial" w:eastAsia="Arial" w:cs="Arial"/>
+          <w:i/>
+          <w:iCs/>
+          <w:sz w:val="22"/>
+          <w:szCs w:val="22"/>
         </w:rPr>
         <w:t>Asistencia en el desarrollo de líneas de código (programación)</w:t>
       </w:r>
     </w:p>
     <w:p>
       <w:pPr>
-        <w:shd w:val="clear" w:color="auto" w:fill="FFFFFF"/>
-        <w:jc w:val="both"/>
-        <w:rPr>
-          <w:i/>
-        </w:rPr>
-      </w:pPr>
-      <w:r>
+        <w:shd w:val="clear" w:fill="FFFFFF"/>
+        <w:jc w:val="both"/>
+        <w:rPr>
+          <w:i/>
+        </w:rPr>
+      </w:pPr>
+      <w:r>
+        <w:rPr>
+          <w:rFonts w:ascii="Arial" w:hAnsi="Arial" w:eastAsia="Arial" w:cs="Arial"/>
+          <w:sz w:val="22"/>
+          <w:szCs w:val="22"/>
+        </w:rPr>
         <w:t>Ejemplo de uso: Soporte en el desarrollo, depuración y optimización de scripts en Python para la integración del middleware y la evaluación métrica.</w:t>
-        <w:br/>
+      </w:r>
+      <w:r>
+        <w:br w:type="textWrapping"/>
+      </w:r>
+      <w:r>
+        <w:rPr>
+          <w:rFonts w:ascii="Arial" w:hAnsi="Arial" w:eastAsia="Arial" w:cs="Arial"/>
+          <w:sz w:val="22"/>
+          <w:szCs w:val="22"/>
+        </w:rPr>
         <w:t>- Prompt: "Escribe una función vectorial en Python con NumPy y Shapely para calcular el área acumulada cubierta por la huella de un sensor circular de 50 m a lo largo de una trayectoria de vuelo."</w:t>
-        <w:br/>
+      </w:r>
+      <w:r>
+        <w:br w:type="textWrapping"/>
+      </w:r>
+      <w:r>
+        <w:rPr>
+          <w:rFonts w:ascii="Arial" w:hAnsi="Arial" w:eastAsia="Arial" w:cs="Arial"/>
+          <w:sz w:val="22"/>
+          <w:szCs w:val="22"/>
+        </w:rPr>
         <w:t>- Interacción: Integración y validación dentro de la clase PathEvaluatorTFM.</w:t>
       </w:r>
     </w:p>
     <w:p>
       <w:pPr>
-        <w:shd w:val="clear" w:color="auto" w:fill="FFFFFF"/>
-        <w:jc w:val="both"/>
-        <w:rPr>
-          <w:i/>
-        </w:rPr>
-      </w:pPr>
-    </w:p>
-    <w:p>
-      <w:pPr>
-        <w:shd w:val="clear" w:color="auto" w:fill="FFFFFF"/>
-        <w:jc w:val="both"/>
-        <w:rPr>
-          <w:i/>
-        </w:rPr>
-      </w:pPr>
-    </w:p>
-    <w:p>
-      <w:pPr>
-        <w:shd w:val="clear" w:color="auto" w:fill="FFFFFF"/>
-        <w:jc w:val="both"/>
-        <w:rPr>
-          <w:i/>
-        </w:rPr>
-      </w:pPr>
-    </w:p>
-    <w:p>
-      <w:pPr>
-        <w:shd w:val="clear" w:color="auto" w:fill="FFFFFF"/>
-        <w:jc w:val="both"/>
-        <w:rPr>
-          <w:i/>
-        </w:rPr>
-      </w:pPr>
-    </w:p>
-    <w:p>
-      <w:pPr>
-        <w:shd w:val="clear" w:color="auto" w:fill="FFFFFF"/>
-        <w:jc w:val="both"/>
-        <w:rPr>
-          <w:i/>
-        </w:rPr>
-      </w:pPr>
-    </w:p>
-    <w:p>
-      <w:pPr>
-        <w:shd w:val="clear" w:color="auto" w:fill="FFFFFF"/>
-        <w:jc w:val="both"/>
-        <w:rPr>
-          <w:i/>
-        </w:rPr>
-      </w:pPr>
-    </w:p>
-    <w:p>
-      <w:pPr>
-        <w:shd w:val="clear" w:color="auto" w:fill="FFFFFF"/>
-        <w:jc w:val="both"/>
-        <w:rPr>
-          <w:i/>
-        </w:rPr>
-      </w:pPr>
-    </w:p>
-    <w:p>
-      <w:pPr>
-        <w:shd w:val="clear" w:color="auto" w:fill="FFFFFF"/>
+        <w:shd w:val="clear" w:fill="FFFFFF"/>
+        <w:jc w:val="both"/>
+        <w:rPr>
+          <w:i/>
+        </w:rPr>
+      </w:pPr>
+    </w:p>
+    <w:p>
+      <w:pPr>
+        <w:shd w:val="clear" w:fill="FFFFFF"/>
+        <w:jc w:val="both"/>
+        <w:rPr>
+          <w:i/>
+        </w:rPr>
+      </w:pPr>
+    </w:p>
+    <w:p>
+      <w:pPr>
+        <w:shd w:val="clear" w:fill="FFFFFF"/>
+        <w:jc w:val="both"/>
+        <w:rPr>
+          <w:i/>
+        </w:rPr>
+      </w:pPr>
+    </w:p>
+    <w:p>
+      <w:pPr>
+        <w:shd w:val="clear" w:fill="FFFFFF"/>
+        <w:jc w:val="both"/>
+        <w:rPr>
+          <w:i/>
+        </w:rPr>
+      </w:pPr>
+    </w:p>
+    <w:p>
+      <w:pPr>
+        <w:shd w:val="clear" w:fill="FFFFFF"/>
+        <w:jc w:val="both"/>
+        <w:rPr>
+          <w:i/>
+        </w:rPr>
+      </w:pPr>
+    </w:p>
+    <w:p>
+      <w:pPr>
+        <w:shd w:val="clear" w:fill="FFFFFF"/>
+        <w:jc w:val="both"/>
+        <w:rPr>
+          <w:i/>
+        </w:rPr>
+      </w:pPr>
+    </w:p>
+    <w:p>
+      <w:pPr>
+        <w:shd w:val="clear" w:fill="FFFFFF"/>
+        <w:jc w:val="both"/>
+        <w:rPr>
+          <w:i/>
+        </w:rPr>
+      </w:pPr>
+    </w:p>
+    <w:p>
+      <w:pPr>
+        <w:shd w:val="clear" w:fill="FFFFFF"/>
         <w:ind w:left="1440"/>
         <w:jc w:val="both"/>
         <w:rPr>
@@ -1553,210 +1957,122 @@
           <w:ilvl w:val="0"/>
           <w:numId w:val="2"/>
         </w:numPr>
-        <w:shd w:val="clear" w:color="auto" w:fill="FFFFFF"/>
-        <w:jc w:val="both"/>
-        <w:rPr>
-          <w:i/>
-        </w:rPr>
-      </w:pPr>
-      <w:r>
-        <w:rPr>
-          <w:i/>
+        <w:shd w:val="clear" w:fill="FFFFFF"/>
+        <w:ind w:left="720" w:hanging="360"/>
+        <w:jc w:val="both"/>
+        <w:rPr>
+          <w:i/>
+        </w:rPr>
+      </w:pPr>
+      <w:r>
+        <w:rPr>
+          <w:rFonts w:ascii="Arial" w:hAnsi="Arial" w:eastAsia="Arial" w:cs="Arial"/>
+          <w:i/>
+          <w:iCs/>
+          <w:sz w:val="22"/>
+          <w:szCs w:val="22"/>
         </w:rPr>
         <w:t>Generación de esquemas, imágenes, audios o vídeos</w:t>
       </w:r>
     </w:p>
     <w:p>
       <w:pPr>
-        <w:shd w:val="clear" w:color="auto" w:fill="FFFFFF"/>
-        <w:jc w:val="both"/>
-        <w:rPr>
-          <w:i/>
-        </w:rPr>
-      </w:pPr>
-      <w:r>
-        <w:rPr>
-          <w:noProof/>
-        </w:rPr>
-        <mc:AlternateContent>
-          <mc:Choice Requires="wps">
-            <w:drawing>
-              <wp:anchor distT="0" distB="0" distL="114300" distR="114300" simplePos="0" relativeHeight="251662336" behindDoc="0" locked="0" layoutInCell="1" hidden="0" allowOverlap="1" wp14:anchorId="41B895B3" wp14:editId="6153CA45">
-                <wp:simplePos x="0" y="0"/>
-                <wp:positionH relativeFrom="column">
-                  <wp:posOffset>76201</wp:posOffset>
-                </wp:positionH>
-                <wp:positionV relativeFrom="paragraph">
-                  <wp:posOffset>101600</wp:posOffset>
-                </wp:positionV>
-                <wp:extent cx="5924550" cy="1514475"/>
-                <wp:effectExtent l="0" t="0" r="0" b="0"/>
-                <wp:wrapNone/>
-                <wp:docPr id="25" name="Rectángulo 25"/>
-                <wp:cNvGraphicFramePr/>
-                <a:graphic xmlns:a="http://schemas.openxmlformats.org/drawingml/2006/main">
-                  <a:graphicData uri="http://schemas.microsoft.com/office/word/2010/wordprocessingShape">
-                    <wps:wsp>
-                      <wps:cNvSpPr/>
-                      <wps:spPr>
-                        <a:xfrm>
-                          <a:off x="2393250" y="3032288"/>
-                          <a:ext cx="5905500" cy="1495425"/>
-                        </a:xfrm>
-                        <a:prstGeom prst="rect">
-                          <a:avLst/>
-                        </a:prstGeom>
-                        <a:solidFill>
-                          <a:schemeClr val="lt1"/>
-                        </a:solidFill>
-                        <a:ln w="9525" cap="flat" cmpd="sng">
-                          <a:solidFill>
-                            <a:srgbClr val="000000"/>
-                          </a:solidFill>
-                          <a:prstDash val="solid"/>
-                          <a:round/>
-                          <a:headEnd type="none" w="sm" len="sm"/>
-                          <a:tailEnd type="none" w="sm" len="sm"/>
-                        </a:ln>
-                      </wps:spPr>
-                      <wps:txbx>
-                        <w:txbxContent>
-                          <w:p>
-                            <w:pPr>
-                              <w:spacing w:line="275" w:lineRule="auto"/>
-                              <w:jc w:val="both"/>
-                              <w:textDirection w:val="btLr"/>
-                            </w:pPr>
-                            <w:r>
-                              <w:rPr>
-                                <w:i/>
-                                <w:color w:val="CC0000"/>
-                              </w:rPr>
-                              <w:t xml:space="preserve">[indicar su uso en este apartado, así como mediante una nota al pie de la figura/elemento generado por IAG] </w:t>
-                            </w:r>
-                            <w:r>
-                              <w:rPr>
-                                <w:i/>
-                                <w:color w:val="38761D"/>
-                              </w:rPr>
-                              <w:t>Por ejemplo: Fuente: elaboración propia con ayuda de Midjourney.</w:t>
-                            </w:r>
-                          </w:p>
-                          <w:p>
-                            <w:pPr>
-                              <w:spacing w:line="275" w:lineRule="auto"/>
-                              <w:textDirection w:val="btLr"/>
-                            </w:pPr>
-                          </w:p>
-                        </w:txbxContent>
-                      </wps:txbx>
-                      <wps:bodyPr spcFirstLastPara="1" wrap="square" lIns="91425" tIns="45700" rIns="91425" bIns="45700" anchor="t" anchorCtr="0">
-                        <a:noAutofit/>
-                      </wps:bodyPr>
-                    </wps:wsp>
-                  </a:graphicData>
-                </a:graphic>
-              </wp:anchor>
-            </w:drawing>
-          </mc:Choice>
-          <mc:Fallback>
-            <w:pict>
-              <v:rect w14:anchorId="41B895B3" id="Rectángulo 25" o:spid="_x0000_s1030" style="position:absolute;left:0;text-align:left;margin-left:6pt;margin-top:8pt;width:466.5pt;height:119.25pt;z-index:251662336;visibility:visible;mso-wrap-style:square;mso-wrap-distance-left:9pt;mso-wrap-distance-top:0;mso-wrap-distance-right:9pt;mso-wrap-distance-bottom:0;mso-position-horizontal:absolute;mso-position-horizontal-relative:text;mso-position-vertical:absolute;mso-position-vertical-relative:text;v-text-anchor:top" o:gfxdata="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" fillcolor="white [3201]">
-                <v:stroke startarrowwidth="narrow" startarrowlength="short" endarrowwidth="narrow" endarrowlength="short" joinstyle="round"/>
-                <v:textbox inset="2.53958mm,1.2694mm,2.53958mm,1.2694mm">
-                  <w:txbxContent>
-                    <w:p>
-                      <w:pPr>
-                        <w:spacing w:line="275" w:lineRule="auto"/>
-                        <w:jc w:val="both"/>
-                        <w:textDirection w:val="btLr"/>
-                      </w:pPr>
-                      <w:r>
-                        <w:rPr>
-                          <w:i/>
-                          <w:color w:val="CC0000"/>
-                        </w:rPr>
-                        <w:t xml:space="preserve">[indicar su uso en este apartado, así como mediante una nota al pie de la figura/elemento generado por IAG] </w:t>
-                      </w:r>
-                      <w:r>
-                        <w:rPr>
-                          <w:i/>
-                          <w:color w:val="38761D"/>
-                        </w:rPr>
-                        <w:t>Por ejemplo: Fuente: elaboración propia con ayuda de Midjourney.</w:t>
-                      </w:r>
-                    </w:p>
-                    <w:p>
-                      <w:pPr>
-                        <w:spacing w:line="275" w:lineRule="auto"/>
-                        <w:textDirection w:val="btLr"/>
-                      </w:pPr>
-                    </w:p>
-                  </w:txbxContent>
-                </v:textbox>
-              </v:rect>
-            </w:pict>
-          </mc:Fallback>
-        </mc:AlternateContent>
-      </w:r>
-    </w:p>
-    <w:p>
-      <w:pPr>
-        <w:shd w:val="clear" w:color="auto" w:fill="FFFFFF"/>
-        <w:jc w:val="both"/>
-        <w:rPr>
-          <w:i/>
-        </w:rPr>
-      </w:pPr>
-    </w:p>
-    <w:p>
-      <w:pPr>
-        <w:shd w:val="clear" w:color="auto" w:fill="FFFFFF"/>
-        <w:jc w:val="both"/>
-        <w:rPr>
-          <w:i/>
-        </w:rPr>
-      </w:pPr>
-    </w:p>
-    <w:p>
-      <w:pPr>
-        <w:shd w:val="clear" w:color="auto" w:fill="FFFFFF"/>
-        <w:jc w:val="both"/>
-        <w:rPr>
-          <w:i/>
-        </w:rPr>
-      </w:pPr>
-    </w:p>
-    <w:p>
-      <w:pPr>
-        <w:shd w:val="clear" w:color="auto" w:fill="FFFFFF"/>
-        <w:jc w:val="both"/>
-        <w:rPr>
-          <w:i/>
-        </w:rPr>
-      </w:pPr>
-    </w:p>
-    <w:p>
-      <w:pPr>
-        <w:shd w:val="clear" w:color="auto" w:fill="FFFFFF"/>
-        <w:jc w:val="both"/>
-        <w:rPr>
-          <w:i/>
-        </w:rPr>
-      </w:pPr>
-    </w:p>
-    <w:p>
-      <w:pPr>
-        <w:shd w:val="clear" w:color="auto" w:fill="FFFFFF"/>
-        <w:jc w:val="both"/>
-        <w:rPr>
-          <w:i/>
-        </w:rPr>
-      </w:pPr>
-    </w:p>
-    <w:p>
-      <w:pPr>
-        <w:shd w:val="clear" w:color="auto" w:fill="FFFFFF"/>
+        <w:shd w:val="clear" w:fill="FFFFFF"/>
+        <w:jc w:val="both"/>
+        <w:rPr>
+          <w:i/>
+        </w:rPr>
+      </w:pPr>
+      <w:r>
+        <w:drawing>
+          <wp:anchor distT="0" distB="0" distL="114300" distR="114300" simplePos="0" relativeHeight="251658240" behindDoc="0" locked="0" layoutInCell="1" allowOverlap="1">
+            <wp:simplePos x="0" y="0"/>
+            <wp:positionH relativeFrom="column">
+              <wp:posOffset>76201</wp:posOffset>
+            </wp:positionH>
+            <wp:positionV relativeFrom="paragraph">
+              <wp:posOffset>101600</wp:posOffset>
+            </wp:positionV>
+            <wp:extent cx="5924550" cy="1514475"/>
+            <wp:effectExtent l="0" t="0" r="0" b="0"/>
+            <wp:wrapNone/>
+            <wp:docPr id="25" name="Shape 25"/>
+            <wp:cNvGraphicFramePr/>
+            <a:graphic xmlns:a="http://schemas.openxmlformats.org/drawingml/2006/main">
+              <a:graphicData uri="http://schemas.microsoft.com/office/word/2010/wordprocessingShape">
+                <wps:wsp>
+                  <wps:cNvSpPr/>
+                  <wps:spPr>
+                    <a:xfrm>
+                      <a:off x="0" y="0"/>
+                      <a:ext cx="5924550" cy="1514475"/>
+                    </a:xfrm>
+                    <a:prstGeom prst="rect">
+                      <a:avLst/>
+                    </a:prstGeom>
+                    <a:noFill/>
+                    <a:ln w="9525">
+                      <a:solidFill>
+                        <a:srgbClr val="000000"/>
+                      </a:solidFill>
+                    </a:ln>
+                  </wps:spPr>
+                  <wps:bodyPr rot="0" vert="horz" lIns="95250" tIns="47625" rIns="95250" bIns="47625"/>
+                </wps:wsp>
+              </a:graphicData>
+            </a:graphic>
+          </wp:anchor>
+        </w:drawing>
+      </w:r>
+    </w:p>
+    <w:p>
+      <w:pPr>
+        <w:shd w:val="clear" w:fill="FFFFFF"/>
+        <w:jc w:val="both"/>
+        <w:rPr>
+          <w:i/>
+        </w:rPr>
+      </w:pPr>
+    </w:p>
+    <w:p>
+      <w:pPr>
+        <w:shd w:val="clear" w:fill="FFFFFF"/>
+        <w:jc w:val="both"/>
+        <w:rPr>
+          <w:i/>
+        </w:rPr>
+      </w:pPr>
+    </w:p>
+    <w:p>
+      <w:pPr>
+        <w:shd w:val="clear" w:fill="FFFFFF"/>
+        <w:jc w:val="both"/>
+        <w:rPr>
+          <w:i/>
+        </w:rPr>
+      </w:pPr>
+    </w:p>
+    <w:p>
+      <w:pPr>
+        <w:shd w:val="clear" w:fill="FFFFFF"/>
+        <w:jc w:val="both"/>
+        <w:rPr>
+          <w:i/>
+        </w:rPr>
+      </w:pPr>
+    </w:p>
+    <w:p>
+      <w:pPr>
+        <w:shd w:val="clear" w:fill="FFFFFF"/>
+        <w:jc w:val="both"/>
+        <w:rPr>
+          <w:i/>
+        </w:rPr>
+      </w:pPr>
+    </w:p>
+    <w:p>
+      <w:pPr>
+        <w:shd w:val="clear" w:fill="FFFFFF"/>
         <w:ind w:left="1440"/>
         <w:jc w:val="both"/>
         <w:rPr>
@@ -1766,7 +2082,7 @@
     </w:p>
     <w:p>
       <w:pPr>
-        <w:shd w:val="clear" w:color="auto" w:fill="FFFFFF"/>
+        <w:shd w:val="clear" w:fill="FFFFFF"/>
         <w:ind w:left="1440"/>
         <w:jc w:val="both"/>
         <w:rPr>
@@ -1776,7 +2092,7 @@
     </w:p>
     <w:p>
       <w:pPr>
-        <w:shd w:val="clear" w:color="auto" w:fill="FFFFFF"/>
+        <w:shd w:val="clear" w:fill="FFFFFF"/>
         <w:ind w:left="1440"/>
         <w:jc w:val="both"/>
         <w:rPr>
@@ -1790,23 +2106,28 @@
           <w:ilvl w:val="0"/>
           <w:numId w:val="2"/>
         </w:numPr>
-        <w:shd w:val="clear" w:color="auto" w:fill="FFFFFF"/>
-        <w:jc w:val="both"/>
-        <w:rPr>
-          <w:i/>
-        </w:rPr>
-      </w:pPr>
-      <w:r>
-        <w:rPr>
-          <w:i/>
-        </w:rPr>
+        <w:shd w:val="clear" w:fill="FFFFFF"/>
+        <w:ind w:left="720" w:hanging="360"/>
+        <w:jc w:val="both"/>
+        <w:rPr>
+          <w:i/>
+        </w:rPr>
+      </w:pPr>
+      <w:r>
         <w:lastRenderedPageBreak/>
+        <w:rPr>
+          <w:rFonts w:ascii="Arial" w:hAnsi="Arial" w:eastAsia="Arial" w:cs="Arial"/>
+          <w:i/>
+          <w:iCs/>
+          <w:sz w:val="22"/>
+          <w:szCs w:val="22"/>
+        </w:rPr>
         <w:t>Procesos de optimización</w:t>
       </w:r>
     </w:p>
     <w:p>
       <w:pPr>
-        <w:shd w:val="clear" w:color="auto" w:fill="FFFFFF"/>
+        <w:shd w:val="clear" w:fill="FFFFFF"/>
         <w:ind w:left="720"/>
         <w:jc w:val="both"/>
         <w:rPr>
@@ -1814,222 +2135,152 @@
         </w:rPr>
       </w:pPr>
       <w:r>
+        <w:rPr>
+          <w:rFonts w:ascii="Arial" w:hAnsi="Arial" w:eastAsia="Arial" w:cs="Arial"/>
+          <w:sz w:val="22"/>
+          <w:szCs w:val="22"/>
+        </w:rPr>
         <w:t>Ejemplo de uso: Optimización computacional del Filtro Recursivo Bayesiano (RBF) y scripts de calibración de hiperparámetros con Optuna.</w:t>
-        <w:br/>
+      </w:r>
+      <w:r>
+        <w:br w:type="textWrapping"/>
+      </w:r>
+      <w:r>
+        <w:rPr>
+          <w:rFonts w:ascii="Arial" w:hAnsi="Arial" w:eastAsia="Arial" w:cs="Arial"/>
+          <w:sz w:val="22"/>
+          <w:szCs w:val="22"/>
+        </w:rPr>
         <w:t>- Prompt: "Optimiza el bucle de actualización bayesiana en NumPy para que solo recalcule la creencia dentro de la caja envolvente de la huella del sensor."</w:t>
-        <w:br/>
-        <w:t>- Interacción: Reducción drástica del tiempo por simulación, haciendo viable la ejecución masiva de 900 misiones en el servidor.</w:t>
-      </w:r>
-    </w:p>
-    <w:p>
-      <w:pPr>
-        <w:shd w:val="clear" w:color="auto" w:fill="FFFFFF"/>
-        <w:jc w:val="both"/>
-        <w:rPr>
-          <w:i/>
-        </w:rPr>
-      </w:pPr>
-      <w:r>
-        <w:rPr>
-          <w:noProof/>
-        </w:rPr>
-        <mc:AlternateContent>
-          <mc:Choice Requires="wps">
-            <w:drawing>
-              <wp:anchor distT="0" distB="0" distL="114300" distR="114300" simplePos="0" relativeHeight="251663360" behindDoc="0" locked="0" layoutInCell="1" hidden="0" allowOverlap="1" wp14:anchorId="66839587" wp14:editId="610C3B6D">
-                <wp:simplePos x="0" y="0"/>
-                <wp:positionH relativeFrom="column">
-                  <wp:posOffset>88901</wp:posOffset>
-                </wp:positionH>
-                <wp:positionV relativeFrom="paragraph">
-                  <wp:posOffset>63500</wp:posOffset>
-                </wp:positionV>
-                <wp:extent cx="5991225" cy="1495425"/>
-                <wp:effectExtent l="0" t="0" r="0" b="0"/>
-                <wp:wrapNone/>
-                <wp:docPr id="20" name="Rectángulo 20"/>
-                <wp:cNvGraphicFramePr/>
-                <a:graphic xmlns:a="http://schemas.openxmlformats.org/drawingml/2006/main">
-                  <a:graphicData uri="http://schemas.microsoft.com/office/word/2010/wordprocessingShape">
-                    <wps:wsp>
-                      <wps:cNvSpPr/>
-                      <wps:spPr>
-                        <a:xfrm>
-                          <a:off x="2359913" y="3041813"/>
-                          <a:ext cx="5972175" cy="1476375"/>
-                        </a:xfrm>
-                        <a:prstGeom prst="rect">
-                          <a:avLst/>
-                        </a:prstGeom>
-                        <a:solidFill>
-                          <a:schemeClr val="lt1"/>
-                        </a:solidFill>
-                        <a:ln w="9525" cap="flat" cmpd="sng">
-                          <a:solidFill>
-                            <a:srgbClr val="000000"/>
-                          </a:solidFill>
-                          <a:prstDash val="solid"/>
-                          <a:round/>
-                          <a:headEnd type="none" w="sm" len="sm"/>
-                          <a:tailEnd type="none" w="sm" len="sm"/>
-                        </a:ln>
-                      </wps:spPr>
-                      <wps:txbx>
-                        <w:txbxContent>
-                          <w:p>
-                            <w:pPr>
-                              <w:spacing w:line="275" w:lineRule="auto"/>
-                              <w:jc w:val="both"/>
-                              <w:textDirection w:val="btLr"/>
-                            </w:pPr>
-                            <w:r>
-                              <w:rPr>
-                                <w:i/>
-                                <w:color w:val="CC0000"/>
-                              </w:rPr>
-                              <w:t>[Añade un ejemplo del flujo habitual de uso para optimizar]</w:t>
-                            </w:r>
-                            <w:r>
-                              <w:rPr>
-                                <w:i/>
-                                <w:color w:val="38761D"/>
-                              </w:rPr>
-                              <w:t xml:space="preserve"> Por ejemplo: he solicitado ayuda para corregir y explicar errores de un código que no funcionaba correctamente. </w:t>
-                            </w:r>
-                          </w:p>
-                          <w:p>
-                            <w:pPr>
-                              <w:spacing w:line="275" w:lineRule="auto"/>
-                              <w:textDirection w:val="btLr"/>
-                            </w:pPr>
-                          </w:p>
-                        </w:txbxContent>
-                      </wps:txbx>
-                      <wps:bodyPr spcFirstLastPara="1" wrap="square" lIns="91425" tIns="45700" rIns="91425" bIns="45700" anchor="t" anchorCtr="0">
-                        <a:noAutofit/>
-                      </wps:bodyPr>
-                    </wps:wsp>
-                  </a:graphicData>
-                </a:graphic>
-              </wp:anchor>
-            </w:drawing>
-          </mc:Choice>
-          <mc:Fallback>
-            <w:pict>
-              <v:rect w14:anchorId="66839587" id="Rectángulo 20" o:spid="_x0000_s1031" style="position:absolute;left:0;text-align:left;margin-left:7pt;margin-top:5pt;width:471.75pt;height:117.75pt;z-index:251663360;visibility:visible;mso-wrap-style:square;mso-wrap-distance-left:9pt;mso-wrap-distance-top:0;mso-wrap-distance-right:9pt;mso-wrap-distance-bottom:0;mso-position-horizontal:absolute;mso-position-horizontal-relative:text;mso-position-vertical:absolute;mso-position-vertical-relative:text;v-text-anchor:top" o:gfxdata="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" fillcolor="white [3201]">
-                <v:stroke startarrowwidth="narrow" startarrowlength="short" endarrowwidth="narrow" endarrowlength="short" joinstyle="round"/>
-                <v:textbox inset="2.53958mm,1.2694mm,2.53958mm,1.2694mm">
-                  <w:txbxContent>
-                    <w:p>
-                      <w:pPr>
-                        <w:spacing w:line="275" w:lineRule="auto"/>
-                        <w:jc w:val="both"/>
-                        <w:textDirection w:val="btLr"/>
-                      </w:pPr>
-                      <w:r>
-                        <w:rPr>
-                          <w:i/>
-                          <w:color w:val="CC0000"/>
-                        </w:rPr>
-                        <w:t>[Añade un ejemplo del flujo habitual de uso para optimizar]</w:t>
-                      </w:r>
-                      <w:r>
-                        <w:rPr>
-                          <w:i/>
-                          <w:color w:val="38761D"/>
-                        </w:rPr>
-                        <w:t xml:space="preserve"> Por ejemplo: he solicitado ayuda para corregir y explicar errores de un código que no funcionaba correctamente. </w:t>
-                      </w:r>
-                    </w:p>
-                    <w:p>
-                      <w:pPr>
-                        <w:spacing w:line="275" w:lineRule="auto"/>
-                        <w:textDirection w:val="btLr"/>
-                      </w:pPr>
-                    </w:p>
-                  </w:txbxContent>
-                </v:textbox>
-              </v:rect>
-            </w:pict>
-          </mc:Fallback>
-        </mc:AlternateContent>
-      </w:r>
-    </w:p>
-    <w:p>
-      <w:pPr>
-        <w:shd w:val="clear" w:color="auto" w:fill="FFFFFF"/>
-        <w:jc w:val="both"/>
-        <w:rPr>
-          <w:i/>
-        </w:rPr>
-      </w:pPr>
-    </w:p>
-    <w:p>
-      <w:pPr>
-        <w:shd w:val="clear" w:color="auto" w:fill="FFFFFF"/>
-        <w:jc w:val="both"/>
-        <w:rPr>
-          <w:i/>
-        </w:rPr>
-      </w:pPr>
-    </w:p>
-    <w:p>
-      <w:pPr>
-        <w:shd w:val="clear" w:color="auto" w:fill="FFFFFF"/>
-        <w:jc w:val="both"/>
-        <w:rPr>
-          <w:i/>
-        </w:rPr>
-      </w:pPr>
-    </w:p>
-    <w:p>
-      <w:pPr>
-        <w:shd w:val="clear" w:color="auto" w:fill="FFFFFF"/>
-        <w:jc w:val="both"/>
-        <w:rPr>
-          <w:i/>
-        </w:rPr>
-      </w:pPr>
-    </w:p>
-    <w:p>
-      <w:pPr>
-        <w:shd w:val="clear" w:color="auto" w:fill="FFFFFF"/>
-        <w:jc w:val="both"/>
-        <w:rPr>
-          <w:i/>
-        </w:rPr>
-      </w:pPr>
-    </w:p>
-    <w:p>
-      <w:pPr>
-        <w:shd w:val="clear" w:color="auto" w:fill="FFFFFF"/>
-        <w:jc w:val="both"/>
-        <w:rPr>
-          <w:i/>
-        </w:rPr>
-      </w:pPr>
-    </w:p>
-    <w:p>
-      <w:pPr>
-        <w:shd w:val="clear" w:color="auto" w:fill="FFFFFF"/>
-        <w:jc w:val="both"/>
-        <w:rPr>
-          <w:i/>
-        </w:rPr>
-      </w:pPr>
-    </w:p>
-    <w:p>
-      <w:pPr>
-        <w:shd w:val="clear" w:color="auto" w:fill="FFFFFF"/>
-        <w:jc w:val="both"/>
-        <w:rPr>
-          <w:i/>
-        </w:rPr>
-      </w:pPr>
-    </w:p>
-    <w:p>
-      <w:pPr>
-        <w:shd w:val="clear" w:color="auto" w:fill="FFFFFF"/>
+      </w:r>
+      <w:r>
+        <w:br w:type="textWrapping"/>
+      </w:r>
+      <w:r>
+        <w:rPr>
+          <w:rFonts w:ascii="Arial" w:hAnsi="Arial" w:eastAsia="Arial" w:cs="Arial"/>
+          <w:sz w:val="22"/>
+          <w:szCs w:val="22"/>
+        </w:rPr>
+        <w:t>- Interacción: Reducción drástica del tiempo por simulación, haciendo viable la ejecución masiva de 900 misiones en local.</w:t>
+      </w:r>
+    </w:p>
+    <w:p>
+      <w:pPr>
+        <w:shd w:val="clear" w:fill="FFFFFF"/>
+        <w:jc w:val="both"/>
+        <w:rPr>
+          <w:i/>
+        </w:rPr>
+      </w:pPr>
+      <w:r>
+        <w:drawing>
+          <wp:anchor distT="0" distB="0" distL="114300" distR="114300" simplePos="0" relativeHeight="251658240" behindDoc="0" locked="0" layoutInCell="1" allowOverlap="1">
+            <wp:simplePos x="0" y="0"/>
+            <wp:positionH relativeFrom="column">
+              <wp:posOffset>88901</wp:posOffset>
+            </wp:positionH>
+            <wp:positionV relativeFrom="paragraph">
+              <wp:posOffset>63500</wp:posOffset>
+            </wp:positionV>
+            <wp:extent cx="5991225" cy="1495425"/>
+            <wp:effectExtent l="0" t="0" r="0" b="0"/>
+            <wp:wrapNone/>
+            <wp:docPr id="20" name="Shape 20"/>
+            <wp:cNvGraphicFramePr/>
+            <a:graphic xmlns:a="http://schemas.openxmlformats.org/drawingml/2006/main">
+              <a:graphicData uri="http://schemas.microsoft.com/office/word/2010/wordprocessingShape">
+                <wps:wsp>
+                  <wps:cNvSpPr/>
+                  <wps:spPr>
+                    <a:xfrm>
+                      <a:off x="0" y="0"/>
+                      <a:ext cx="5991225" cy="1495425"/>
+                    </a:xfrm>
+                    <a:prstGeom prst="rect">
+                      <a:avLst/>
+                    </a:prstGeom>
+                    <a:noFill/>
+                    <a:ln w="9525">
+                      <a:solidFill>
+                        <a:srgbClr val="000000"/>
+                      </a:solidFill>
+                    </a:ln>
+                  </wps:spPr>
+                  <wps:bodyPr rot="0" vert="horz" lIns="95250" tIns="47625" rIns="95250" bIns="47625"/>
+                </wps:wsp>
+              </a:graphicData>
+            </a:graphic>
+          </wp:anchor>
+        </w:drawing>
+      </w:r>
+    </w:p>
+    <w:p>
+      <w:pPr>
+        <w:shd w:val="clear" w:fill="FFFFFF"/>
+        <w:jc w:val="both"/>
+        <w:rPr>
+          <w:i/>
+        </w:rPr>
+      </w:pPr>
+    </w:p>
+    <w:p>
+      <w:pPr>
+        <w:shd w:val="clear" w:fill="FFFFFF"/>
+        <w:jc w:val="both"/>
+        <w:rPr>
+          <w:i/>
+        </w:rPr>
+      </w:pPr>
+    </w:p>
+    <w:p>
+      <w:pPr>
+        <w:shd w:val="clear" w:fill="FFFFFF"/>
+        <w:jc w:val="both"/>
+        <w:rPr>
+          <w:i/>
+        </w:rPr>
+      </w:pPr>
+    </w:p>
+    <w:p>
+      <w:pPr>
+        <w:shd w:val="clear" w:fill="FFFFFF"/>
+        <w:jc w:val="both"/>
+        <w:rPr>
+          <w:i/>
+        </w:rPr>
+      </w:pPr>
+    </w:p>
+    <w:p>
+      <w:pPr>
+        <w:shd w:val="clear" w:fill="FFFFFF"/>
+        <w:jc w:val="both"/>
+        <w:rPr>
+          <w:i/>
+        </w:rPr>
+      </w:pPr>
+    </w:p>
+    <w:p>
+      <w:pPr>
+        <w:shd w:val="clear" w:fill="FFFFFF"/>
+        <w:jc w:val="both"/>
+        <w:rPr>
+          <w:i/>
+        </w:rPr>
+      </w:pPr>
+    </w:p>
+    <w:p>
+      <w:pPr>
+        <w:shd w:val="clear" w:fill="FFFFFF"/>
+        <w:jc w:val="both"/>
+        <w:rPr>
+          <w:i/>
+        </w:rPr>
+      </w:pPr>
+    </w:p>
+    <w:p>
+      <w:pPr>
+        <w:shd w:val="clear" w:fill="FFFFFF"/>
         <w:jc w:val="both"/>
         <w:rPr>
           <w:i/>
@@ -2042,110 +2293,138 @@
           <w:ilvl w:val="0"/>
           <w:numId w:val="2"/>
         </w:numPr>
-        <w:shd w:val="clear" w:color="auto" w:fill="FFFFFF"/>
-        <w:jc w:val="both"/>
-        <w:rPr>
-          <w:i/>
-        </w:rPr>
-      </w:pPr>
-      <w:r>
-        <w:rPr>
-          <w:i/>
+        <w:shd w:val="clear" w:fill="FFFFFF"/>
+        <w:ind w:left="720" w:hanging="360"/>
+        <w:jc w:val="both"/>
+        <w:rPr>
+          <w:i/>
+        </w:rPr>
+      </w:pPr>
+      <w:r>
+        <w:rPr>
+          <w:rFonts w:ascii="Arial" w:hAnsi="Arial" w:eastAsia="Arial" w:cs="Arial"/>
+          <w:i/>
+          <w:iCs/>
+          <w:sz w:val="22"/>
+          <w:szCs w:val="22"/>
         </w:rPr>
         <w:t>Tratamiento de datos: recogida, análisis, cruce de datos…</w:t>
       </w:r>
     </w:p>
     <w:p>
       <w:pPr>
-        <w:shd w:val="clear" w:color="auto" w:fill="FFFFFF"/>
-        <w:jc w:val="both"/>
-        <w:rPr>
-          <w:i/>
-        </w:rPr>
-      </w:pPr>
-      <w:r>
+        <w:shd w:val="clear" w:fill="FFFFFF"/>
+        <w:jc w:val="both"/>
+        <w:rPr>
+          <w:i/>
+        </w:rPr>
+      </w:pPr>
+      <w:r>
+        <w:rPr>
+          <w:rFonts w:ascii="Arial" w:hAnsi="Arial" w:eastAsia="Arial" w:cs="Arial"/>
+          <w:sz w:val="22"/>
+          <w:szCs w:val="22"/>
+        </w:rPr>
         <w:t>Ejemplo de uso: Automatización del cruce, consolidación y formato de los resultados experimentales de las 900 simulaciones de Montecarlo.</w:t>
-        <w:br/>
+      </w:r>
+      <w:r>
+        <w:br w:type="textWrapping"/>
+      </w:r>
+      <w:r>
+        <w:rPr>
+          <w:rFonts w:ascii="Arial" w:hAnsi="Arial" w:eastAsia="Arial" w:cs="Arial"/>
+          <w:sz w:val="22"/>
+          <w:szCs w:val="22"/>
+        </w:rPr>
         <w:t>- Prompt: "Genera un script en Python con pandas para agrupar los resultados del CSV maestro por perfil y algoritmo, calculando media y desviación estándar para exportar las tablas maestras a formato LaTeX."</w:t>
-        <w:br/>
+      </w:r>
+      <w:r>
+        <w:br w:type="textWrapping"/>
+      </w:r>
+      <w:r>
+        <w:rPr>
+          <w:rFonts w:ascii="Arial" w:hAnsi="Arial" w:eastAsia="Arial" w:cs="Arial"/>
+          <w:sz w:val="22"/>
+          <w:szCs w:val="22"/>
+        </w:rPr>
         <w:t>- Interacción: Comprobación de integridad estadística e inclusión de las 3 tablas maestras en el Capítulo 6.</w:t>
       </w:r>
     </w:p>
     <w:p>
       <w:pPr>
-        <w:shd w:val="clear" w:color="auto" w:fill="FFFFFF"/>
-        <w:jc w:val="both"/>
-        <w:rPr>
-          <w:i/>
-        </w:rPr>
-      </w:pPr>
-    </w:p>
-    <w:p>
-      <w:pPr>
-        <w:shd w:val="clear" w:color="auto" w:fill="FFFFFF"/>
-        <w:jc w:val="both"/>
-        <w:rPr>
-          <w:i/>
-        </w:rPr>
-      </w:pPr>
-    </w:p>
-    <w:p>
-      <w:pPr>
-        <w:shd w:val="clear" w:color="auto" w:fill="FFFFFF"/>
-        <w:jc w:val="both"/>
-        <w:rPr>
-          <w:i/>
-        </w:rPr>
-      </w:pPr>
-    </w:p>
-    <w:p>
-      <w:pPr>
-        <w:shd w:val="clear" w:color="auto" w:fill="FFFFFF"/>
-        <w:jc w:val="both"/>
-        <w:rPr>
-          <w:i/>
-        </w:rPr>
-      </w:pPr>
-    </w:p>
-    <w:p>
-      <w:pPr>
-        <w:shd w:val="clear" w:color="auto" w:fill="FFFFFF"/>
-        <w:jc w:val="both"/>
-        <w:rPr>
-          <w:i/>
-        </w:rPr>
-      </w:pPr>
-    </w:p>
-    <w:p>
-      <w:pPr>
-        <w:shd w:val="clear" w:color="auto" w:fill="FFFFFF"/>
-        <w:jc w:val="both"/>
-        <w:rPr>
-          <w:i/>
-        </w:rPr>
-      </w:pPr>
-    </w:p>
-    <w:p>
-      <w:pPr>
-        <w:shd w:val="clear" w:color="auto" w:fill="FFFFFF"/>
-        <w:jc w:val="both"/>
-        <w:rPr>
-          <w:i/>
-        </w:rPr>
-      </w:pPr>
-    </w:p>
-    <w:p>
-      <w:pPr>
-        <w:shd w:val="clear" w:color="auto" w:fill="FFFFFF"/>
-        <w:jc w:val="both"/>
-        <w:rPr>
-          <w:i/>
-        </w:rPr>
-      </w:pPr>
-    </w:p>
-    <w:p>
-      <w:pPr>
-        <w:shd w:val="clear" w:color="auto" w:fill="FFFFFF"/>
+        <w:shd w:val="clear" w:fill="FFFFFF"/>
+        <w:jc w:val="both"/>
+        <w:rPr>
+          <w:i/>
+        </w:rPr>
+      </w:pPr>
+    </w:p>
+    <w:p>
+      <w:pPr>
+        <w:shd w:val="clear" w:fill="FFFFFF"/>
+        <w:jc w:val="both"/>
+        <w:rPr>
+          <w:i/>
+        </w:rPr>
+      </w:pPr>
+    </w:p>
+    <w:p>
+      <w:pPr>
+        <w:shd w:val="clear" w:fill="FFFFFF"/>
+        <w:jc w:val="both"/>
+        <w:rPr>
+          <w:i/>
+        </w:rPr>
+      </w:pPr>
+    </w:p>
+    <w:p>
+      <w:pPr>
+        <w:shd w:val="clear" w:fill="FFFFFF"/>
+        <w:jc w:val="both"/>
+        <w:rPr>
+          <w:i/>
+        </w:rPr>
+      </w:pPr>
+    </w:p>
+    <w:p>
+      <w:pPr>
+        <w:shd w:val="clear" w:fill="FFFFFF"/>
+        <w:jc w:val="both"/>
+        <w:rPr>
+          <w:i/>
+        </w:rPr>
+      </w:pPr>
+    </w:p>
+    <w:p>
+      <w:pPr>
+        <w:shd w:val="clear" w:fill="FFFFFF"/>
+        <w:jc w:val="both"/>
+        <w:rPr>
+          <w:i/>
+        </w:rPr>
+      </w:pPr>
+    </w:p>
+    <w:p>
+      <w:pPr>
+        <w:shd w:val="clear" w:fill="FFFFFF"/>
+        <w:jc w:val="both"/>
+        <w:rPr>
+          <w:i/>
+        </w:rPr>
+      </w:pPr>
+    </w:p>
+    <w:p>
+      <w:pPr>
+        <w:shd w:val="clear" w:fill="FFFFFF"/>
+        <w:jc w:val="both"/>
+        <w:rPr>
+          <w:i/>
+        </w:rPr>
+      </w:pPr>
+    </w:p>
+    <w:p>
+      <w:pPr>
+        <w:shd w:val="clear" w:fill="FFFFFF"/>
         <w:jc w:val="both"/>
         <w:rPr>
           <w:i/>
@@ -2158,228 +2437,140 @@
           <w:ilvl w:val="0"/>
           <w:numId w:val="2"/>
         </w:numPr>
-        <w:shd w:val="clear" w:color="auto" w:fill="FFFFFF"/>
-        <w:jc w:val="both"/>
-        <w:rPr>
-          <w:i/>
-        </w:rPr>
-      </w:pPr>
-      <w:r>
-        <w:rPr>
-          <w:i/>
+        <w:shd w:val="clear" w:fill="FFFFFF"/>
+        <w:ind w:left="720" w:hanging="360"/>
+        <w:jc w:val="both"/>
+        <w:rPr>
+          <w:i/>
+        </w:rPr>
+      </w:pPr>
+      <w:r>
+        <w:rPr>
+          <w:rFonts w:ascii="Arial" w:hAnsi="Arial" w:eastAsia="Arial" w:cs="Arial"/>
+          <w:i/>
+          <w:iCs/>
+          <w:sz w:val="22"/>
+          <w:szCs w:val="22"/>
         </w:rPr>
         <w:t>Inspiración de ideas en el proceso creativo</w:t>
       </w:r>
     </w:p>
     <w:p>
       <w:pPr>
-        <w:shd w:val="clear" w:color="auto" w:fill="FFFFFF"/>
-        <w:jc w:val="both"/>
-        <w:rPr>
-          <w:i/>
-        </w:rPr>
-      </w:pPr>
-      <w:r>
-        <w:rPr>
-          <w:noProof/>
-        </w:rPr>
-        <mc:AlternateContent>
-          <mc:Choice Requires="wps">
-            <w:drawing>
-              <wp:anchor distT="0" distB="0" distL="114300" distR="114300" simplePos="0" relativeHeight="251665408" behindDoc="0" locked="0" layoutInCell="1" hidden="0" allowOverlap="1" wp14:anchorId="3AD80805" wp14:editId="0CB87B84">
-                <wp:simplePos x="0" y="0"/>
-                <wp:positionH relativeFrom="column">
-                  <wp:posOffset>88901</wp:posOffset>
-                </wp:positionH>
-                <wp:positionV relativeFrom="paragraph">
-                  <wp:posOffset>152400</wp:posOffset>
-                </wp:positionV>
-                <wp:extent cx="6067425" cy="1600200"/>
-                <wp:effectExtent l="0" t="0" r="0" b="0"/>
-                <wp:wrapNone/>
-                <wp:docPr id="26" name="Rectángulo 26"/>
-                <wp:cNvGraphicFramePr/>
-                <a:graphic xmlns:a="http://schemas.openxmlformats.org/drawingml/2006/main">
-                  <a:graphicData uri="http://schemas.microsoft.com/office/word/2010/wordprocessingShape">
-                    <wps:wsp>
-                      <wps:cNvSpPr/>
-                      <wps:spPr>
-                        <a:xfrm>
-                          <a:off x="2321813" y="2989425"/>
-                          <a:ext cx="6048375" cy="1581150"/>
-                        </a:xfrm>
-                        <a:prstGeom prst="rect">
-                          <a:avLst/>
-                        </a:prstGeom>
-                        <a:solidFill>
-                          <a:schemeClr val="lt1"/>
-                        </a:solidFill>
-                        <a:ln w="9525" cap="flat" cmpd="sng">
-                          <a:solidFill>
-                            <a:srgbClr val="000000"/>
-                          </a:solidFill>
-                          <a:prstDash val="solid"/>
-                          <a:round/>
-                          <a:headEnd type="none" w="sm" len="sm"/>
-                          <a:tailEnd type="none" w="sm" len="sm"/>
-                        </a:ln>
-                      </wps:spPr>
-                      <wps:txbx>
-                        <w:txbxContent>
-                          <w:p>
-                            <w:pPr>
-                              <w:spacing w:line="275" w:lineRule="auto"/>
-                              <w:jc w:val="both"/>
-                              <w:textDirection w:val="btLr"/>
-                            </w:pPr>
-                            <w:r>
-                              <w:rPr>
-                                <w:i/>
-                                <w:color w:val="CC0000"/>
-                              </w:rPr>
-                              <w:t xml:space="preserve">[Añade un ejemplo] </w:t>
-                            </w:r>
-                            <w:r>
-                              <w:rPr>
-                                <w:i/>
-                                <w:color w:val="38761D"/>
-                              </w:rPr>
-                              <w:t>Por ejemplo: una vez he tenido claro el objetivo del trabajo he solicitado ideas para abarcar el proyecto desde un enfoque multidisciplinar.</w:t>
-                            </w:r>
-                          </w:p>
-                          <w:p>
-                            <w:pPr>
-                              <w:spacing w:line="275" w:lineRule="auto"/>
-                              <w:textDirection w:val="btLr"/>
-                            </w:pPr>
-                          </w:p>
-                        </w:txbxContent>
-                      </wps:txbx>
-                      <wps:bodyPr spcFirstLastPara="1" wrap="square" lIns="91425" tIns="45700" rIns="91425" bIns="45700" anchor="t" anchorCtr="0">
-                        <a:noAutofit/>
-                      </wps:bodyPr>
-                    </wps:wsp>
-                  </a:graphicData>
-                </a:graphic>
-              </wp:anchor>
-            </w:drawing>
-          </mc:Choice>
-          <mc:Fallback>
-            <w:pict>
-              <v:rect w14:anchorId="3AD80805" id="Rectángulo 26" o:spid="_x0000_s1033" style="position:absolute;left:0;text-align:left;margin-left:7pt;margin-top:12pt;width:477.75pt;height:126pt;z-index:251665408;visibility:visible;mso-wrap-style:square;mso-wrap-distance-left:9pt;mso-wrap-distance-top:0;mso-wrap-distance-right:9pt;mso-wrap-distance-bottom:0;mso-position-horizontal:absolute;mso-position-horizontal-relative:text;mso-position-vertical:absolute;mso-position-vertical-relative:text;v-text-anchor:top" o:gfxdata="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" fillcolor="white [3201]">
-                <v:stroke startarrowwidth="narrow" startarrowlength="short" endarrowwidth="narrow" endarrowlength="short" joinstyle="round"/>
-                <v:textbox inset="2.53958mm,1.2694mm,2.53958mm,1.2694mm">
-                  <w:txbxContent>
-                    <w:p>
-                      <w:pPr>
-                        <w:spacing w:line="275" w:lineRule="auto"/>
-                        <w:jc w:val="both"/>
-                        <w:textDirection w:val="btLr"/>
-                      </w:pPr>
-                      <w:r>
-                        <w:rPr>
-                          <w:i/>
-                          <w:color w:val="CC0000"/>
-                        </w:rPr>
-                        <w:t xml:space="preserve">[Añade un ejemplo] </w:t>
-                      </w:r>
-                      <w:r>
-                        <w:rPr>
-                          <w:i/>
-                          <w:color w:val="38761D"/>
-                        </w:rPr>
-                        <w:t>Por ejemplo: una vez he tenido claro el objetivo del trabajo he solicitado ideas para abarcar el proyecto desde un enfoque multidisciplinar.</w:t>
-                      </w:r>
-                    </w:p>
-                    <w:p>
-                      <w:pPr>
-                        <w:spacing w:line="275" w:lineRule="auto"/>
-                        <w:textDirection w:val="btLr"/>
-                      </w:pPr>
-                    </w:p>
-                  </w:txbxContent>
-                </v:textbox>
-              </v:rect>
-            </w:pict>
-          </mc:Fallback>
-        </mc:AlternateContent>
-      </w:r>
-    </w:p>
-    <w:p>
-      <w:pPr>
-        <w:shd w:val="clear" w:color="auto" w:fill="FFFFFF"/>
-        <w:jc w:val="both"/>
-        <w:rPr>
-          <w:i/>
-        </w:rPr>
-      </w:pPr>
-    </w:p>
-    <w:p>
-      <w:pPr>
-        <w:shd w:val="clear" w:color="auto" w:fill="FFFFFF"/>
-        <w:jc w:val="both"/>
-        <w:rPr>
-          <w:i/>
-        </w:rPr>
-      </w:pPr>
-    </w:p>
-    <w:p>
-      <w:pPr>
-        <w:shd w:val="clear" w:color="auto" w:fill="FFFFFF"/>
-        <w:jc w:val="both"/>
-        <w:rPr>
-          <w:i/>
-        </w:rPr>
-      </w:pPr>
-    </w:p>
-    <w:p>
-      <w:pPr>
-        <w:shd w:val="clear" w:color="auto" w:fill="FFFFFF"/>
-        <w:jc w:val="both"/>
-        <w:rPr>
-          <w:i/>
-        </w:rPr>
-      </w:pPr>
-    </w:p>
-    <w:p>
-      <w:pPr>
-        <w:shd w:val="clear" w:color="auto" w:fill="FFFFFF"/>
-        <w:jc w:val="both"/>
-        <w:rPr>
-          <w:i/>
-        </w:rPr>
-      </w:pPr>
-    </w:p>
-    <w:p>
-      <w:pPr>
-        <w:shd w:val="clear" w:color="auto" w:fill="FFFFFF"/>
-        <w:jc w:val="both"/>
-        <w:rPr>
-          <w:i/>
-        </w:rPr>
-      </w:pPr>
-    </w:p>
-    <w:p>
-      <w:pPr>
-        <w:shd w:val="clear" w:color="auto" w:fill="FFFFFF"/>
-        <w:jc w:val="both"/>
-        <w:rPr>
-          <w:i/>
-        </w:rPr>
-      </w:pPr>
-    </w:p>
-    <w:p>
-      <w:pPr>
-        <w:shd w:val="clear" w:color="auto" w:fill="FFFFFF"/>
-        <w:jc w:val="both"/>
-        <w:rPr>
-          <w:i/>
-        </w:rPr>
-      </w:pPr>
-    </w:p>
-    <w:p>
-      <w:pPr>
-        <w:shd w:val="clear" w:color="auto" w:fill="FFFFFF"/>
+        <w:shd w:val="clear" w:fill="FFFFFF"/>
+        <w:jc w:val="both"/>
+        <w:rPr>
+          <w:i/>
+        </w:rPr>
+      </w:pPr>
+      <w:r>
+        <w:drawing>
+          <wp:anchor distT="0" distB="0" distL="114300" distR="114300" simplePos="0" relativeHeight="251658240" behindDoc="0" locked="0" layoutInCell="1" allowOverlap="1">
+            <wp:simplePos x="0" y="0"/>
+            <wp:positionH relativeFrom="column">
+              <wp:posOffset>88901</wp:posOffset>
+            </wp:positionH>
+            <wp:positionV relativeFrom="paragraph">
+              <wp:posOffset>152400</wp:posOffset>
+            </wp:positionV>
+            <wp:extent cx="6067425" cy="1600200"/>
+            <wp:effectExtent l="0" t="0" r="0" b="0"/>
+            <wp:wrapNone/>
+            <wp:docPr id="26" name="Shape 26"/>
+            <wp:cNvGraphicFramePr/>
+            <a:graphic xmlns:a="http://schemas.openxmlformats.org/drawingml/2006/main">
+              <a:graphicData uri="http://schemas.microsoft.com/office/word/2010/wordprocessingShape">
+                <wps:wsp>
+                  <wps:cNvSpPr/>
+                  <wps:spPr>
+                    <a:xfrm>
+                      <a:off x="0" y="0"/>
+                      <a:ext cx="6067425" cy="1600200"/>
+                    </a:xfrm>
+                    <a:prstGeom prst="rect">
+                      <a:avLst/>
+                    </a:prstGeom>
+                    <a:noFill/>
+                    <a:ln w="9525">
+                      <a:solidFill>
+                        <a:srgbClr val="000000"/>
+                      </a:solidFill>
+                    </a:ln>
+                  </wps:spPr>
+                  <wps:bodyPr rot="0" vert="horz" lIns="95250" tIns="47625" rIns="95250" bIns="47625"/>
+                </wps:wsp>
+              </a:graphicData>
+            </a:graphic>
+          </wp:anchor>
+        </w:drawing>
+      </w:r>
+    </w:p>
+    <w:p>
+      <w:pPr>
+        <w:shd w:val="clear" w:fill="FFFFFF"/>
+        <w:jc w:val="both"/>
+        <w:rPr>
+          <w:i/>
+        </w:rPr>
+      </w:pPr>
+    </w:p>
+    <w:p>
+      <w:pPr>
+        <w:shd w:val="clear" w:fill="FFFFFF"/>
+        <w:jc w:val="both"/>
+        <w:rPr>
+          <w:i/>
+        </w:rPr>
+      </w:pPr>
+    </w:p>
+    <w:p>
+      <w:pPr>
+        <w:shd w:val="clear" w:fill="FFFFFF"/>
+        <w:jc w:val="both"/>
+        <w:rPr>
+          <w:i/>
+        </w:rPr>
+      </w:pPr>
+    </w:p>
+    <w:p>
+      <w:pPr>
+        <w:shd w:val="clear" w:fill="FFFFFF"/>
+        <w:jc w:val="both"/>
+        <w:rPr>
+          <w:i/>
+        </w:rPr>
+      </w:pPr>
+    </w:p>
+    <w:p>
+      <w:pPr>
+        <w:shd w:val="clear" w:fill="FFFFFF"/>
+        <w:jc w:val="both"/>
+        <w:rPr>
+          <w:i/>
+        </w:rPr>
+      </w:pPr>
+    </w:p>
+    <w:p>
+      <w:pPr>
+        <w:shd w:val="clear" w:fill="FFFFFF"/>
+        <w:jc w:val="both"/>
+        <w:rPr>
+          <w:i/>
+        </w:rPr>
+      </w:pPr>
+    </w:p>
+    <w:p>
+      <w:pPr>
+        <w:shd w:val="clear" w:fill="FFFFFF"/>
+        <w:jc w:val="both"/>
+        <w:rPr>
+          <w:i/>
+        </w:rPr>
+      </w:pPr>
+    </w:p>
+    <w:p>
+      <w:pPr>
+        <w:shd w:val="clear" w:fill="FFFFFF"/>
         <w:jc w:val="both"/>
         <w:rPr>
           <w:i/>
@@ -2392,15 +2583,20 @@
           <w:ilvl w:val="0"/>
           <w:numId w:val="2"/>
         </w:numPr>
-        <w:shd w:val="clear" w:color="auto" w:fill="FFFFFF"/>
-        <w:jc w:val="both"/>
-        <w:rPr>
-          <w:i/>
-        </w:rPr>
-      </w:pPr>
-      <w:r>
-        <w:rPr>
-          <w:i/>
+        <w:shd w:val="clear" w:fill="FFFFFF"/>
+        <w:ind w:left="720" w:hanging="360"/>
+        <w:jc w:val="both"/>
+        <w:rPr>
+          <w:i/>
+        </w:rPr>
+      </w:pPr>
+      <w:r>
+        <w:rPr>
+          <w:rFonts w:ascii="Arial" w:hAnsi="Arial" w:eastAsia="Arial" w:cs="Arial"/>
+          <w:i/>
+          <w:iCs/>
+          <w:sz w:val="22"/>
+          <w:szCs w:val="22"/>
         </w:rPr>
         <w:t>Otros usos vinculados a la generación de puntos concretos del desarrollo específico del trabajo</w:t>
       </w:r>
@@ -2419,6 +2615,11 @@
         <w:jc w:val="both"/>
       </w:pPr>
       <w:r>
+        <w:rPr>
+          <w:rFonts w:ascii="Arial" w:hAnsi="Arial" w:eastAsia="Arial" w:cs="Arial"/>
+          <w:sz w:val="22"/>
+          <w:szCs w:val="22"/>
+        </w:rPr>
         <w:t>Si crees necesario incluirlo, añade, en cada uno de los casos:</w:t>
       </w:r>
     </w:p>
@@ -2437,27 +2638,45 @@
       </w:pPr>
       <w:r>
         <w:rPr>
-          <w:b/>
+          <w:rFonts w:ascii="Arial" w:hAnsi="Arial" w:eastAsia="Arial" w:cs="Arial"/>
+          <w:b/>
+          <w:bCs/>
+          <w:sz w:val="22"/>
+          <w:szCs w:val="22"/>
         </w:rPr>
         <w:t xml:space="preserve">empleando el </w:t>
       </w:r>
       <w:r>
         <w:rPr>
-          <w:b/>
-          <w:i/>
+          <w:rFonts w:ascii="Arial" w:hAnsi="Arial" w:eastAsia="Arial" w:cs="Arial"/>
+          <w:b/>
+          <w:bCs/>
+          <w:i/>
+          <w:iCs/>
+          <w:sz w:val="22"/>
+          <w:szCs w:val="22"/>
         </w:rPr>
         <w:t>prompt</w:t>
       </w:r>
       <w:r>
         <w:rPr>
-          <w:i/>
+          <w:rFonts w:ascii="Arial" w:hAnsi="Arial" w:eastAsia="Arial" w:cs="Arial"/>
+          <w:i/>
+          <w:iCs/>
+          <w:sz w:val="22"/>
+          <w:szCs w:val="22"/>
         </w:rPr>
         <w:t xml:space="preserve"> </w:t>
       </w:r>
       <w:r>
         <w:rPr>
-          <w:b/>
-          <w:i/>
+          <w:rFonts w:ascii="Arial" w:hAnsi="Arial" w:eastAsia="Arial" w:cs="Arial"/>
+          <w:b/>
+          <w:bCs/>
+          <w:i/>
+          <w:iCs/>
+          <w:sz w:val="22"/>
+          <w:szCs w:val="22"/>
         </w:rPr>
         <w:t xml:space="preserve"> …</w:t>
       </w:r>
@@ -2468,7 +2687,11 @@
       </w:pPr>
       <w:r>
         <w:rPr>
-          <w:i/>
+          <w:rFonts w:ascii="Arial" w:hAnsi="Arial" w:eastAsia="Arial" w:cs="Arial"/>
+          <w:i/>
+          <w:iCs/>
+          <w:sz w:val="22"/>
+          <w:szCs w:val="22"/>
         </w:rPr>
         <w:t xml:space="preserve">           (escribe la petición realizada a la IAG)</w:t>
       </w:r>
@@ -2482,7 +2705,11 @@
       </w:pPr>
       <w:r>
         <w:rPr>
-          <w:b/>
+          <w:rFonts w:ascii="Arial" w:hAnsi="Arial" w:eastAsia="Arial" w:cs="Arial"/>
+          <w:b/>
+          <w:bCs/>
+          <w:sz w:val="22"/>
+          <w:szCs w:val="22"/>
         </w:rPr>
         <w:t>teniendo como interacción …</w:t>
       </w:r>
@@ -2496,7 +2723,11 @@
       </w:pPr>
       <w:r>
         <w:rPr>
-          <w:i/>
+          <w:rFonts w:ascii="Arial" w:hAnsi="Arial" w:eastAsia="Arial" w:cs="Arial"/>
+          <w:i/>
+          <w:iCs/>
+          <w:sz w:val="22"/>
+          <w:szCs w:val="22"/>
         </w:rPr>
         <w:t xml:space="preserve">           (describe qué interacción realizaste con la IAG tras la respuesta del prompt)</w:t>
       </w:r>
@@ -2514,7 +2745,7 @@
       <w:pPr>
         <w:jc w:val="both"/>
         <w:rPr>
-          <w:rFonts w:ascii="Roboto" w:eastAsia="Roboto" w:hAnsi="Roboto" w:cs="Roboto"/>
+          <w:rFonts w:ascii="Roboto" w:hAnsi="Roboto" w:eastAsia="Roboto" w:cs="Roboto"/>
           <w:i/>
           <w:color w:val="6AA84F"/>
           <w:highlight w:val="white"/>
@@ -2522,127 +2753,197 @@
       </w:pPr>
       <w:r>
         <w:rPr>
+          <w:rFonts w:ascii="Arial" w:hAnsi="Arial" w:eastAsia="Arial" w:cs="Arial"/>
           <w:color w:val="434343"/>
+          <w:sz w:val="22"/>
+          <w:szCs w:val="22"/>
         </w:rPr>
         <w:t xml:space="preserve">Ejemplo: </w:t>
       </w:r>
       <w:r>
         <w:rPr>
-          <w:b/>
-          <w:i/>
+          <w:rFonts w:ascii="Arial" w:hAnsi="Arial" w:eastAsia="Arial" w:cs="Arial"/>
+          <w:b/>
+          <w:bCs/>
+          <w:i/>
+          <w:iCs/>
           <w:color w:val="6AA84F"/>
+          <w:sz w:val="22"/>
+          <w:szCs w:val="22"/>
         </w:rPr>
         <w:t xml:space="preserve">Declaro </w:t>
       </w:r>
       <w:r>
         <w:rPr>
-          <w:i/>
+          <w:rFonts w:ascii="Arial" w:hAnsi="Arial" w:eastAsia="Arial" w:cs="Arial"/>
+          <w:i/>
+          <w:iCs/>
           <w:color w:val="6AA84F"/>
+          <w:sz w:val="22"/>
+          <w:szCs w:val="22"/>
         </w:rPr>
         <w:t xml:space="preserve">haber hecho uso del sistema de IAG </w:t>
       </w:r>
       <w:r>
         <w:rPr>
-          <w:b/>
-          <w:i/>
+          <w:rFonts w:ascii="Arial" w:hAnsi="Arial" w:eastAsia="Arial" w:cs="Arial"/>
+          <w:b/>
+          <w:bCs/>
+          <w:i/>
+          <w:iCs/>
           <w:color w:val="6AA84F"/>
+          <w:sz w:val="22"/>
+          <w:szCs w:val="22"/>
         </w:rPr>
         <w:t xml:space="preserve">Chat GPT </w:t>
       </w:r>
       <w:r>
         <w:rPr>
-          <w:b/>
-          <w:i/>
+          <w:rFonts w:ascii="Arial" w:hAnsi="Arial" w:eastAsia="Arial" w:cs="Arial"/>
+          <w:b/>
+          <w:bCs/>
+          <w:i/>
+          <w:iCs/>
           <w:color w:val="6AA84F"/>
+          <w:sz w:val="22"/>
+          <w:szCs w:val="22"/>
         </w:rPr>
         <w:t>X.x</w:t>
       </w:r>
       <w:r>
         <w:rPr>
-          <w:i/>
+          <w:rFonts w:ascii="Arial" w:hAnsi="Arial" w:eastAsia="Arial" w:cs="Arial"/>
+          <w:i/>
+          <w:iCs/>
           <w:color w:val="6AA84F"/>
+          <w:sz w:val="22"/>
+          <w:szCs w:val="22"/>
         </w:rPr>
         <w:t xml:space="preserve"> para </w:t>
       </w:r>
       <w:r>
         <w:rPr>
-          <w:b/>
-          <w:i/>
+          <w:rFonts w:ascii="Arial" w:hAnsi="Arial" w:eastAsia="Arial" w:cs="Arial"/>
+          <w:b/>
+          <w:bCs/>
+          <w:i/>
+          <w:iCs/>
           <w:color w:val="6AA84F"/>
+          <w:sz w:val="22"/>
+          <w:szCs w:val="22"/>
         </w:rPr>
         <w:t>buscar información</w:t>
       </w:r>
       <w:r>
         <w:rPr>
-          <w:i/>
+          <w:rFonts w:ascii="Arial" w:hAnsi="Arial" w:eastAsia="Arial" w:cs="Arial"/>
+          <w:i/>
+          <w:iCs/>
           <w:color w:val="6AA84F"/>
+          <w:sz w:val="22"/>
+          <w:szCs w:val="22"/>
         </w:rPr>
         <w:t xml:space="preserve"> empleando </w:t>
       </w:r>
       <w:r>
         <w:rPr>
-          <w:b/>
-          <w:i/>
+          <w:rFonts w:ascii="Arial" w:hAnsi="Arial" w:eastAsia="Arial" w:cs="Arial"/>
+          <w:b/>
+          <w:bCs/>
+          <w:i/>
+          <w:iCs/>
           <w:color w:val="6AA84F"/>
+          <w:sz w:val="22"/>
+          <w:szCs w:val="22"/>
         </w:rPr>
         <w:t>el prompt:</w:t>
       </w:r>
       <w:r>
         <w:rPr>
-          <w:i/>
+          <w:rFonts w:ascii="Arial" w:hAnsi="Arial" w:eastAsia="Arial" w:cs="Arial"/>
+          <w:i/>
+          <w:iCs/>
           <w:color w:val="6AA84F"/>
+          <w:sz w:val="22"/>
+          <w:szCs w:val="22"/>
         </w:rPr>
         <w:t xml:space="preserve"> “</w:t>
       </w:r>
       <w:r>
         <w:rPr>
-          <w:b/>
-          <w:i/>
+          <w:rFonts w:ascii="Arial" w:hAnsi="Arial" w:eastAsia="Arial" w:cs="Arial"/>
+          <w:b/>
+          <w:bCs/>
+          <w:i/>
+          <w:iCs/>
           <w:color w:val="6AA84F"/>
+          <w:sz w:val="22"/>
+          <w:szCs w:val="22"/>
         </w:rPr>
         <w:t>Dime un ejemplo concreto que ilustre la aplicación de la propuesta urbanística de la Ciudad de los 15 minutos en España”</w:t>
       </w:r>
       <w:r>
         <w:rPr>
-          <w:i/>
+          <w:rFonts w:ascii="Arial" w:hAnsi="Arial" w:eastAsia="Arial" w:cs="Arial"/>
+          <w:i/>
+          <w:iCs/>
           <w:color w:val="6AA84F"/>
+          <w:sz w:val="22"/>
+          <w:szCs w:val="22"/>
         </w:rPr>
         <w:t xml:space="preserve"> teniendo como interacción</w:t>
       </w:r>
       <w:r>
         <w:rPr>
-          <w:b/>
-          <w:i/>
+          <w:rFonts w:ascii="Arial" w:hAnsi="Arial" w:eastAsia="Arial" w:cs="Arial"/>
+          <w:b/>
+          <w:bCs/>
+          <w:i/>
+          <w:iCs/>
           <w:color w:val="6AA84F"/>
+          <w:sz w:val="22"/>
+          <w:szCs w:val="22"/>
         </w:rPr>
         <w:t xml:space="preserve"> la proposición del ejemplo concreto del distrito de Chamartín que se ha reflejado en la memoria</w:t>
       </w:r>
       <w:r>
         <w:rPr>
-          <w:i/>
+          <w:rFonts w:ascii="Arial" w:hAnsi="Arial" w:eastAsia="Arial" w:cs="Arial"/>
+          <w:i/>
+          <w:iCs/>
           <w:color w:val="6AA84F"/>
+          <w:sz w:val="22"/>
+          <w:szCs w:val="22"/>
         </w:rPr>
         <w:t xml:space="preserve">. </w:t>
       </w:r>
     </w:p>
-    <w:p/>
-    <w:p>
-      <w:pPr>
-        <w:rPr>
-          <w:b/>
-        </w:rPr>
-      </w:pPr>
-    </w:p>
-    <w:p>
-      <w:pPr>
-        <w:shd w:val="clear" w:color="auto" w:fill="D9D9D9"/>
-        <w:rPr>
-          <w:b/>
-        </w:rPr>
-      </w:pPr>
-      <w:r>
-        <w:rPr>
-          <w:b/>
+    <w:p>
+      <w:pPr>
+        <w:spacing w:line="276" w:lineRule="auto"/>
+      </w:pPr>
+    </w:p>
+    <w:p>
+      <w:pPr>
+        <w:rPr>
+          <w:b/>
+        </w:rPr>
+      </w:pPr>
+    </w:p>
+    <w:p>
+      <w:pPr>
+        <w:shd w:val="clear" w:fill="D9D9D9"/>
+        <w:rPr>
+          <w:b/>
+        </w:rPr>
+      </w:pPr>
+      <w:r>
+        <w:rPr>
+          <w:rFonts w:ascii="Arial" w:hAnsi="Arial" w:eastAsia="Arial" w:cs="Arial"/>
+          <w:b/>
+          <w:bCs/>
+          <w:sz w:val="22"/>
+          <w:szCs w:val="22"/>
         </w:rPr>
         <w:t>Parte 3: reflexión sobre utilidad</w:t>
       </w:r>
@@ -2661,6 +2962,11 @@
         <w:jc w:val="both"/>
       </w:pPr>
       <w:r>
+        <w:rPr>
+          <w:rFonts w:ascii="Arial" w:hAnsi="Arial" w:eastAsia="Arial" w:cs="Arial"/>
+          <w:sz w:val="22"/>
+          <w:szCs w:val="22"/>
+        </w:rPr>
         <w:t>Aporta una valoración personal (formato libre) sobre las fortalezas y debilidades que has identificado en el uso de herramientas de IAG en el desarrollo de tu trabajo. Menciona si te ha servido en el proceso de aprendizaje, o en el desarrollo o en la extracción de conclusiones de tu trabajo.</w:t>
       </w:r>
     </w:p>
@@ -2685,7 +2991,13 @@
           <w:insideV w:val="single" w:sz="8" w:space="0" w:color="000000"/>
         </w:tblBorders>
         <w:tblLayout w:type="fixed"/>
-        <w:tblLook w:val="0600" w:firstRow="0" w:lastRow="0" w:firstColumn="0" w:lastColumn="0" w:noHBand="1" w:noVBand="1"/>
+        <w:tblCellMar>
+          <w:top w:w="100" w:type="dxa"/>
+          <w:left w:w="100" w:type="dxa"/>
+          <w:bottom w:w="100" w:type="dxa"/>
+          <w:right w:w="100" w:type="dxa"/>
+        </w:tblCellMar>
+        <w:tblLook w:noHBand="1" w:noVBand="1"/>
       </w:tblPr>
       <w:tblGrid>
         <w:gridCol w:w="9029"/>
@@ -2697,6 +3009,12 @@
         <w:tc>
           <w:tcPr>
             <w:tcW w:w="9029" w:type="dxa"/>
+            <w:tcBorders>
+              <w:top w:val="single" w:sz="8" w:space="0" w:color="000000"/>
+              <w:left w:val="single" w:sz="8" w:space="0" w:color="000000"/>
+              <w:bottom w:val="single" w:sz="8" w:space="0" w:color="000000"/>
+              <w:right w:val="single" w:sz="8" w:space="0" w:color="000000"/>
+            </w:tcBorders>
             <w:tcMar>
               <w:top w:w="100" w:type="dxa"/>
               <w:left w:w="100" w:type="dxa"/>
@@ -2705,16 +3023,57 @@
             </w:tcMar>
           </w:tcPr>
           <w:p>
+            <w:pPr>
+              <w:spacing w:line="276" w:lineRule="auto"/>
+            </w:pPr>
             <w:r>
+              <w:rPr>
+                <w:rFonts w:ascii="Arial" w:hAnsi="Arial" w:eastAsia="Arial" w:cs="Arial"/>
+                <w:sz w:val="22"/>
+                <w:szCs w:val="22"/>
+              </w:rPr>
               <w:t>Valoración personal sobre el uso de IAG:</w:t>
-              <w:br/>
-              <w:br/>
+            </w:r>
+            <w:r>
+              <w:br w:type="textWrapping"/>
+            </w:r>
+            <w:r>
+              <w:br w:type="textWrapping"/>
+            </w:r>
+            <w:r>
+              <w:rPr>
+                <w:rFonts w:ascii="Arial" w:hAnsi="Arial" w:eastAsia="Arial" w:cs="Arial"/>
+                <w:sz w:val="22"/>
+                <w:szCs w:val="22"/>
+              </w:rPr>
               <w:t>El empleo de herramientas de Inteligencia Artificial Generativa durante el desarrollo de este Trabajo de Fin de Máster ha resultado altamente positivo y formativo. Ha funcionado principalmente como un asistente técnico de programación avanzada (pair programming) y de maquetación en LaTeX, permitiendo agilizar tareas mecánicas como la optimización de código en Python, la generación de diagramas modulares en TikZ y el procesamiento estadístico de las 900 simulaciones de Montecarlo.</w:t>
-              <w:br/>
-              <w:br/>
+            </w:r>
+            <w:r>
+              <w:br w:type="textWrapping"/>
+            </w:r>
+            <w:r>
+              <w:br w:type="textWrapping"/>
+            </w:r>
+            <w:r>
+              <w:rPr>
+                <w:rFonts w:ascii="Arial" w:hAnsi="Arial" w:eastAsia="Arial" w:cs="Arial"/>
+                <w:sz w:val="22"/>
+                <w:szCs w:val="22"/>
+              </w:rPr>
               <w:t>Esta asistencia ha liberado un tiempo valioso que he podido destinar al núcleo científico y de ingeniería del trabajo: la formulación del modelo de observación del sensor de 50 metros, el diseño del middleware de proyección UTM, la justificación operativa de la búsqueda coordinada y el análisis crítico del comportamiento de los algoritmos metaheurísticos.</w:t>
-              <w:br/>
-              <w:br/>
+            </w:r>
+            <w:r>
+              <w:br w:type="textWrapping"/>
+            </w:r>
+            <w:r>
+              <w:br w:type="textWrapping"/>
+            </w:r>
+            <w:r>
+              <w:rPr>
+                <w:rFonts w:ascii="Arial" w:hAnsi="Arial" w:eastAsia="Arial" w:cs="Arial"/>
+                <w:sz w:val="22"/>
+                <w:szCs w:val="22"/>
+              </w:rPr>
               <w:t>Como limitación identificada, se constata que estas herramientas requieren una estricta supervisión humana en todo momento: las sugerencias deben ser siempre validadas conceptual, matemática y experimentalmente por el autor para asegurar su corrección técnica y coherencia con la teoría formal de búsqueda.</w:t>
             </w:r>
           </w:p>
@@ -2741,8 +3100,6 @@
       <w:footerReference w:type="default" r:id="rId10"/>
       <w:pgSz w:w="11909" w:h="16834"/>
       <w:pgMar w:top="708" w:right="1440" w:bottom="1440" w:left="1440" w:header="720" w:footer="720" w:gutter="0"/>
-      <w:pgNumType w:start="1"/>
-      <w:cols w:space="720"/>
     </w:sectPr>
   </w:body>
 </w:document>
@@ -2774,7 +3131,7 @@
 </file>
 
 <file path=word/footer1.xml><?xml version="1.0" encoding="utf-8"?>
-<w:ftr xmlns:wpc="http://schemas.microsoft.com/office/word/2010/wordprocessingCanvas" xmlns:cx="http://schemas.microsoft.com/office/drawing/2014/chartex" xmlns:cx1="http://schemas.microsoft.com/office/drawing/2015/9/8/chartex" xmlns:cx2="http://schemas.microsoft.com/office/drawing/2015/10/21/chartex" xmlns:cx3="http://schemas.microsoft.com/office/drawing/2016/5/9/chartex" xmlns:cx4="http://schemas.microsoft.com/office/drawing/2016/5/10/chartex" xmlns:cx5="http://schemas.microsoft.com/office/drawing/2016/5/11/chartex" xmlns:cx6="http://schemas.microsoft.com/office/drawing/2016/5/12/chartex" xmlns:cx7="http://schemas.microsoft.com/office/drawing/2016/5/13/chartex" xmlns:cx8="http://schemas.microsoft.com/office/drawing/2016/5/14/chartex" xmlns:mc="http://schemas.openxmlformats.org/markup-compatibility/2006" xmlns:aink="http://schemas.microsoft.com/office/drawing/2016/ink" xmlns:am3d="http://schemas.microsoft.com/office/drawing/2017/model3d" xmlns:o="urn:schemas-microsoft-com:office:office" xmlns:oel="http://schemas.microsoft.com/office/2019/extlst" xmlns:r="http://schemas.openxmlformats.org/officeDocument/2006/relationships" xmlns:m="http://schemas.openxmlformats.org/officeDocument/2006/math" xmlns:v="urn:schemas-microsoft-com:vml" xmlns:wp14="http://schemas.microsoft.com/office/word/2010/wordprocessingDrawing" xmlns:wp="http://schemas.openxmlformats.org/drawingml/2006/wordprocessingDrawing" xmlns:w10="urn:schemas-microsoft-com:office:word" xmlns:w="http://schemas.openxmlformats.org/wordprocessingml/2006/main" xmlns:w14="http://schemas.microsoft.com/office/word/2010/wordml" xmlns:w15="http://schemas.microsoft.com/office/word/2012/wordml" xmlns:w16cex="http://schemas.microsoft.com/office/word/2018/wordml/cex" xmlns:w16cid="http://schemas.microsoft.com/office/word/2016/wordml/cid" xmlns:w16="http://schemas.microsoft.com/office/word/2018/wordml" xmlns:w16du="http://schemas.microsoft.com/office/word/2023/wordml/word16du" xmlns:w16sdtdh="http://schemas.microsoft.com/office/word/2020/wordml/sdtdatahash" xmlns:w16sdtfl="http://schemas.microsoft.com/office/word/2024/wordml/sdtformatlock" xmlns:w16se="http://schemas.microsoft.com/office/word/2015/wordml/symex" xmlns:wpg="http://schemas.microsoft.com/office/word/2010/wordprocessingGroup" xmlns:wpi="http://schemas.microsoft.com/office/word/2010/wordprocessingInk" xmlns:wne="http://schemas.microsoft.com/office/word/2006/wordml" xmlns:wps="http://schemas.microsoft.com/office/word/2010/wordprocessingShape" mc:Ignorable="w14 w15 w16se w16cid w16 w16cex w16sdtdh w16sdtfl w16du wp14">
+<w:ftr xmlns:wpc="http://schemas.microsoft.com/office/word/2010/wordprocessingCanvas" xmlns:mc="http://schemas.openxmlformats.org/markup-compatibility/2006" xmlns:o="urn:schemas-microsoft-com:office:office" xmlns:r="http://schemas.openxmlformats.org/officeDocument/2006/relationships" xmlns:m="http://schemas.openxmlformats.org/officeDocument/2006/math" xmlns:v="urn:schemas-microsoft-com:vml" xmlns:wp14="http://schemas.microsoft.com/office/word/2010/wordprocessingDrawing" xmlns:wp="http://schemas.openxmlformats.org/drawingml/2006/wordprocessingDrawing" xmlns:w10="urn:schemas-microsoft-com:office:word" xmlns:w="http://schemas.openxmlformats.org/wordprocessingml/2006/main" xmlns:w14="http://schemas.microsoft.com/office/word/2010/wordml" xmlns:w15="http://schemas.microsoft.com/office/word/2012/wordml" xmlns:w16se="http://schemas.microsoft.com/office/word/2015/wordml/symex" xmlns:w16cid="http://schemas.microsoft.com/office/word/2016/wordml/cid" xmlns:w16="http://schemas.microsoft.com/office/word/2018/wordml" xmlns:w16cex="http://schemas.microsoft.com/office/word/2018/wordml/cex" xmlns:w16sdtdh="http://schemas.microsoft.com/office/word/2020/wordml/sdtdatahash" xmlns:wne="http://schemas.microsoft.com/office/word/2006/wordml" xmlns:wpg="http://schemas.microsoft.com/office/word/2010/wordprocessingGroup" xmlns:wps="http://schemas.microsoft.com/office/word/2010/wordprocessingShape">
   <w:p>
     <w:pPr>
       <w:pBdr>
@@ -2814,7 +3171,6 @@
     </w:r>
     <w:r>
       <w:rPr>
-        <w:noProof/>
         <w:color w:val="000000"/>
       </w:rPr>
       <w:t>1</w:t>

</xml_diff>